<commit_message>
PCG Bulk refactor - modularize into app package
- Extract logging, XIQ API, and Azure AD functionality into separate modules
- Move credentials and configuration to top-level global variables
- Add PCG user mapping and bulk operations support
- Use placeholder values for credentials (replace with actual values)

Co-Authored-By: Claude Haiku 4.5 <noreply@anthropic.com>
</commit_message>
<xml_diff>
--- a/XIQ-Azure-AD-PPSK-Sync-Guide.docx
+++ b/XIQ-Azure-AD-PPSK-Sync-Guide.docx
@@ -1,6 +1,6 @@
 
 <file path=word/document.xml><?xml version="1.0" encoding="utf-8"?>
-<w:document xmlns:wpc="http://schemas.microsoft.com/office/word/2010/wordprocessingCanvas" xmlns:cx="http://schemas.microsoft.com/office/drawing/2014/chartex" xmlns:cx1="http://schemas.microsoft.com/office/drawing/2015/9/8/chartex" xmlns:cx2="http://schemas.microsoft.com/office/drawing/2015/10/21/chartex" xmlns:cx3="http://schemas.microsoft.com/office/drawing/2016/5/9/chartex" xmlns:cx4="http://schemas.microsoft.com/office/drawing/2016/5/10/chartex" xmlns:cx5="http://schemas.microsoft.com/office/drawing/2016/5/11/chartex" xmlns:cx6="http://schemas.microsoft.com/office/drawing/2016/5/12/chartex" xmlns:cx7="http://schemas.microsoft.com/office/drawing/2016/5/13/chartex" xmlns:cx8="http://schemas.microsoft.com/office/drawing/2016/5/14/chartex" xmlns:mc="http://schemas.openxmlformats.org/markup-compatibility/2006" xmlns:aink="http://schemas.microsoft.com/office/drawing/2016/ink" xmlns:am3d="http://schemas.microsoft.com/office/drawing/2017/model3d" xmlns:o="urn:schemas-microsoft-com:office:office" xmlns:oel="http://schemas.microsoft.com/office/2019/extlst" xmlns:r="http://schemas.openxmlformats.org/officeDocument/2006/relationships" xmlns:m="http://schemas.openxmlformats.org/officeDocument/2006/math" xmlns:v="urn:schemas-microsoft-com:vml" xmlns:wp14="http://schemas.microsoft.com/office/word/2010/wordprocessingDrawing" xmlns:wp="http://schemas.openxmlformats.org/drawingml/2006/wordprocessingDrawing" xmlns:w10="urn:schemas-microsoft-com:office:word" xmlns:w="http://schemas.openxmlformats.org/wordprocessingml/2006/main" xmlns:w14="http://schemas.microsoft.com/office/word/2010/wordml" xmlns:w15="http://schemas.microsoft.com/office/word/2012/wordml" xmlns:w16cex="http://schemas.microsoft.com/office/word/2018/wordml/cex" xmlns:w16cid="http://schemas.microsoft.com/office/word/2016/wordml/cid" xmlns:w16="http://schemas.microsoft.com/office/word/2018/wordml" xmlns:w16du="http://schemas.microsoft.com/office/word/2023/wordml/word16du" xmlns:w16sdtdh="http://schemas.microsoft.com/office/word/2020/wordml/sdtdatahash" xmlns:w16sdtfl="http://schemas.microsoft.com/office/word/2024/wordml/sdtformatlock" xmlns:w16se="http://schemas.microsoft.com/office/word/2015/wordml/symex" xmlns:wpg="http://schemas.microsoft.com/office/word/2010/wordprocessingGroup" xmlns:wpi="http://schemas.microsoft.com/office/word/2010/wordprocessingInk" xmlns:wne="http://schemas.microsoft.com/office/word/2006/wordml" xmlns:wps="http://schemas.microsoft.com/office/word/2010/wordprocessingShape" mc:Ignorable="w14 w15 w16se w16cid w16 w16cex w16sdtdh w16sdtfl w16du wp14">
+<w:document xmlns:wpc="http://schemas.microsoft.com/office/word/2010/wordprocessingCanvas" xmlns:cx="http://schemas.microsoft.com/office/drawing/2014/chartex" xmlns:cx1="http://schemas.microsoft.com/office/drawing/2015/9/8/chartex" xmlns:cx2="http://schemas.microsoft.com/office/drawing/2015/10/21/chartex" xmlns:cx3="http://schemas.microsoft.com/office/drawing/2016/5/9/chartex" xmlns:cx4="http://schemas.microsoft.com/office/drawing/2016/5/10/chartex" xmlns:cx5="http://schemas.microsoft.com/office/drawing/2016/5/11/chartex" xmlns:cx6="http://schemas.microsoft.com/office/drawing/2016/5/12/chartex" xmlns:cx7="http://schemas.microsoft.com/office/drawing/2016/5/13/chartex" xmlns:cx8="http://schemas.microsoft.com/office/drawing/2016/5/14/chartex" xmlns:mc="http://schemas.openxmlformats.org/markup-compatibility/2006" xmlns:m="http://schemas.openxmlformats.org/officeDocument/2006/math" xmlns:aink="http://schemas.microsoft.com/office/drawing/2016/ink" xmlns:am3d="http://schemas.microsoft.com/office/drawing/2017/model3d" xmlns:oel="http://schemas.microsoft.com/office/2019/extlst" xmlns:r="http://schemas.openxmlformats.org/officeDocument/2006/relationships" xmlns:wp14="http://schemas.microsoft.com/office/word/2010/wordprocessingDrawing" xmlns:wp="http://schemas.openxmlformats.org/drawingml/2006/wordprocessingDrawing" xmlns:wpg="http://schemas.microsoft.com/office/word/2010/wordprocessingGroup" xmlns:wpi="http://schemas.microsoft.com/office/word/2010/wordprocessingInk" xmlns:wps="http://schemas.microsoft.com/office/word/2010/wordprocessingShape" xmlns:o="urn:schemas-microsoft-com:office:office" xmlns:v="urn:schemas-microsoft-com:vml" xmlns:w10="urn:schemas-microsoft-com:office:word" xmlns:w="http://schemas.openxmlformats.org/wordprocessingml/2006/main" xmlns:w14="http://schemas.microsoft.com/office/word/2010/wordml" xmlns:w15="http://schemas.microsoft.com/office/word/2012/wordml" xmlns:w16cex="http://schemas.microsoft.com/office/word/2018/wordml/cex" xmlns:w16cid="http://schemas.microsoft.com/office/word/2016/wordml/cid" xmlns:w16="http://schemas.microsoft.com/office/word/2018/wordml" xmlns:w16sdtdh="http://schemas.microsoft.com/office/word/2020/wordml/sdtdatahash" xmlns:w16sdtfl="http://schemas.microsoft.com/office/word/2024/wordml/sdtformatlock" xmlns:w16se="http://schemas.microsoft.com/office/word/2015/wordml/symex" xmlns:w16du="http://schemas.microsoft.com/office/word/2023/wordml/word16du" xmlns:wne="http://schemas.microsoft.com/office/word/2006/wordml" mc:Ignorable="w14 w15 w16se w16cid w16 w16cex w16sdtdh w16sdtfl w16du wp14">
   <w:body>
     <w:p>
       <w:pPr>
@@ -69,7 +69,7 @@
         <w:rPr>
           <w:rFonts w:asciiTheme="minorHAnsi" w:hAnsiTheme="minorHAnsi" w:cstheme="minorHAnsi"/>
         </w:rPr>
-        <w:t>5</w:t>
+        <w:t>7</w:t>
       </w:r>
       <w:r>
         <w:rPr>
@@ -81,43 +81,31 @@
         <w:rPr>
           <w:rFonts w:asciiTheme="minorHAnsi" w:hAnsiTheme="minorHAnsi" w:cstheme="minorHAnsi"/>
         </w:rPr>
-        <w:t>16</w:t>
-      </w:r>
-      <w:r>
-        <w:rPr>
-          <w:rFonts w:asciiTheme="minorHAnsi" w:hAnsiTheme="minorHAnsi" w:cstheme="minorHAnsi"/>
-        </w:rPr>
-        <w:t>/202</w:t>
-      </w:r>
-      <w:r>
-        <w:rPr>
-          <w:rFonts w:asciiTheme="minorHAnsi" w:hAnsiTheme="minorHAnsi" w:cstheme="minorHAnsi"/>
-        </w:rPr>
-        <w:t>5</w:t>
-      </w:r>
-      <w:r>
-        <w:rPr>
-          <w:rFonts w:asciiTheme="minorHAnsi" w:hAnsiTheme="minorHAnsi" w:cstheme="minorHAnsi"/>
-        </w:rPr>
-        <w:t xml:space="preserve"> – v1.</w:t>
-      </w:r>
-      <w:r>
-        <w:rPr>
-          <w:rFonts w:asciiTheme="minorHAnsi" w:hAnsiTheme="minorHAnsi" w:cstheme="minorHAnsi"/>
-        </w:rPr>
-        <w:t>3</w:t>
-      </w:r>
-      <w:r>
-        <w:rPr>
-          <w:rFonts w:asciiTheme="minorHAnsi" w:hAnsiTheme="minorHAnsi" w:cstheme="minorHAnsi"/>
-        </w:rPr>
-        <w:t>.</w:t>
-      </w:r>
-      <w:r>
-        <w:rPr>
-          <w:rFonts w:asciiTheme="minorHAnsi" w:hAnsiTheme="minorHAnsi" w:cstheme="minorHAnsi"/>
-        </w:rPr>
-        <w:t>0</w:t>
+        <w:t>8</w:t>
+      </w:r>
+      <w:r>
+        <w:rPr>
+          <w:rFonts w:asciiTheme="minorHAnsi" w:hAnsiTheme="minorHAnsi" w:cstheme="minorHAnsi"/>
+        </w:rPr>
+        <w:t>/20</w:t>
+      </w:r>
+      <w:r>
+        <w:rPr>
+          <w:rFonts w:asciiTheme="minorHAnsi" w:hAnsiTheme="minorHAnsi" w:cstheme="minorHAnsi"/>
+        </w:rPr>
+        <w:t>26</w:t>
+      </w:r>
+      <w:r>
+        <w:rPr>
+          <w:rFonts w:asciiTheme="minorHAnsi" w:hAnsiTheme="minorHAnsi" w:cstheme="minorHAnsi"/>
+        </w:rPr>
+        <w:t xml:space="preserve"> – v</w:t>
+      </w:r>
+      <w:r>
+        <w:rPr>
+          <w:rFonts w:asciiTheme="minorHAnsi" w:hAnsiTheme="minorHAnsi" w:cstheme="minorHAnsi"/>
+        </w:rPr>
+        <w:t>3.0.1</w:t>
       </w:r>
     </w:p>
     <w:p>
@@ -244,7 +232,21 @@
         <w:rPr>
           <w:rFonts w:cstheme="minorHAnsi"/>
         </w:rPr>
-        <w:t xml:space="preserve"> ExtremeCloud IQ (XIQ)</w:t>
+        <w:t xml:space="preserve"> </w:t>
+      </w:r>
+      <w:proofErr w:type="spellStart"/>
+      <w:r>
+        <w:rPr>
+          <w:rFonts w:cstheme="minorHAnsi"/>
+        </w:rPr>
+        <w:t>ExtremeCloud</w:t>
+      </w:r>
+      <w:proofErr w:type="spellEnd"/>
+      <w:r>
+        <w:rPr>
+          <w:rFonts w:cstheme="minorHAnsi"/>
+        </w:rPr>
+        <w:t xml:space="preserve"> IQ (XIQ)</w:t>
       </w:r>
       <w:r>
         <w:rPr>
@@ -4703,11 +4705,19 @@
           <w:strike/>
         </w:rPr>
       </w:pPr>
+      <w:proofErr w:type="spellStart"/>
       <w:r>
         <w:rPr>
           <w:rFonts w:cstheme="minorHAnsi"/>
         </w:rPr>
-        <w:t>ExtremeCloud IQ Public Cloud, Private Cloud</w:t>
+        <w:t>ExtremeCloud</w:t>
+      </w:r>
+      <w:proofErr w:type="spellEnd"/>
+      <w:r>
+        <w:rPr>
+          <w:rFonts w:cstheme="minorHAnsi"/>
+        </w:rPr>
+        <w:t xml:space="preserve"> IQ Public Cloud, Private Cloud</w:t>
       </w:r>
       <w:r>
         <w:rPr>
@@ -4812,11 +4822,19 @@
           <w:rFonts w:cstheme="minorHAnsi"/>
         </w:rPr>
       </w:pPr>
+      <w:proofErr w:type="spellStart"/>
       <w:r>
         <w:rPr>
           <w:rFonts w:cstheme="minorHAnsi"/>
         </w:rPr>
-        <w:t xml:space="preserve">RadSec Proxy requires TCP Port 2083 to be open on your internet firewall </w:t>
+        <w:t>RadSec</w:t>
+      </w:r>
+      <w:proofErr w:type="spellEnd"/>
+      <w:r>
+        <w:rPr>
+          <w:rFonts w:cstheme="minorHAnsi"/>
+        </w:rPr>
+        <w:t xml:space="preserve"> Proxy requires TCP Port 2083 to be open on your internet firewall </w:t>
       </w:r>
     </w:p>
     <w:p>
@@ -4852,7 +4870,35 @@
         <w:rPr>
           <w:rFonts w:cstheme="minorHAnsi"/>
         </w:rPr>
-        <w:t>Not supported on wired systems, A3 NAC, or campus-based Wi-Fi systems (WiNG or IdentiFi)</w:t>
+        <w:t>Not supported on wired systems, A3 NAC, or campus-based Wi-Fi systems (</w:t>
+      </w:r>
+      <w:proofErr w:type="spellStart"/>
+      <w:r>
+        <w:rPr>
+          <w:rFonts w:cstheme="minorHAnsi"/>
+        </w:rPr>
+        <w:t>WiNG</w:t>
+      </w:r>
+      <w:proofErr w:type="spellEnd"/>
+      <w:r>
+        <w:rPr>
+          <w:rFonts w:cstheme="minorHAnsi"/>
+        </w:rPr>
+        <w:t xml:space="preserve"> or </w:t>
+      </w:r>
+      <w:proofErr w:type="spellStart"/>
+      <w:r>
+        <w:rPr>
+          <w:rFonts w:cstheme="minorHAnsi"/>
+        </w:rPr>
+        <w:t>IdentiFi</w:t>
+      </w:r>
+      <w:proofErr w:type="spellEnd"/>
+      <w:r>
+        <w:rPr>
+          <w:rFonts w:cstheme="minorHAnsi"/>
+        </w:rPr>
+        <w:t>)</w:t>
       </w:r>
     </w:p>
     <w:p>
@@ -5004,19 +5050,19 @@
         <w:rPr>
           <w:rFonts w:cstheme="minorHAnsi"/>
         </w:rPr>
+        <w:t>3</w:t>
+      </w:r>
+      <w:r>
+        <w:rPr>
+          <w:rFonts w:cstheme="minorHAnsi"/>
+        </w:rPr>
+        <w:t>.</w:t>
+      </w:r>
+      <w:r>
+        <w:rPr>
+          <w:rFonts w:cstheme="minorHAnsi"/>
+        </w:rPr>
         <w:t>1</w:t>
-      </w:r>
-      <w:r>
-        <w:rPr>
-          <w:rFonts w:cstheme="minorHAnsi"/>
-        </w:rPr>
-        <w:t>.</w:t>
-      </w:r>
-      <w:r>
-        <w:rPr>
-          <w:rFonts w:cstheme="minorHAnsi"/>
-        </w:rPr>
-        <w:t>3</w:t>
       </w:r>
       <w:r>
         <w:rPr>
@@ -5388,7 +5434,21 @@
         <w:rPr>
           <w:rFonts w:asciiTheme="minorHAnsi" w:hAnsiTheme="minorHAnsi" w:cstheme="minorHAnsi"/>
         </w:rPr>
-        <w:t xml:space="preserve"> reach out to ExtremeCloud IQ. </w:t>
+        <w:t xml:space="preserve"> reach out to </w:t>
+      </w:r>
+      <w:proofErr w:type="spellStart"/>
+      <w:r>
+        <w:rPr>
+          <w:rFonts w:asciiTheme="minorHAnsi" w:hAnsiTheme="minorHAnsi" w:cstheme="minorHAnsi"/>
+        </w:rPr>
+        <w:t>ExtremeCloud</w:t>
+      </w:r>
+      <w:proofErr w:type="spellEnd"/>
+      <w:r>
+        <w:rPr>
+          <w:rFonts w:asciiTheme="minorHAnsi" w:hAnsiTheme="minorHAnsi" w:cstheme="minorHAnsi"/>
+        </w:rPr>
+        <w:t xml:space="preserve"> IQ. </w:t>
       </w:r>
     </w:p>
     <w:p>
@@ -5525,6 +5585,7 @@
         </w:rPr>
         <w:t xml:space="preserve">ython 3.6 or higher. The device could be a server running </w:t>
       </w:r>
+      <w:proofErr w:type="spellStart"/>
       <w:r>
         <w:rPr>
           <w:rFonts w:asciiTheme="minorHAnsi" w:hAnsiTheme="minorHAnsi" w:cstheme="minorHAnsi"/>
@@ -5535,7 +5596,14 @@
         <w:rPr>
           <w:rFonts w:asciiTheme="minorHAnsi" w:hAnsiTheme="minorHAnsi" w:cstheme="minorHAnsi"/>
         </w:rPr>
-        <w:t xml:space="preserve">edhat, a pc/laptop running </w:t>
+        <w:t>edhat</w:t>
+      </w:r>
+      <w:proofErr w:type="spellEnd"/>
+      <w:r>
+        <w:rPr>
+          <w:rFonts w:asciiTheme="minorHAnsi" w:hAnsiTheme="minorHAnsi" w:cstheme="minorHAnsi"/>
+        </w:rPr>
+        <w:t xml:space="preserve">, a pc/laptop running </w:t>
       </w:r>
       <w:r>
         <w:rPr>
@@ -5613,7 +5681,21 @@
         <w:rPr>
           <w:rFonts w:asciiTheme="minorHAnsi" w:hAnsiTheme="minorHAnsi" w:cstheme="minorHAnsi"/>
         </w:rPr>
-        <w:t xml:space="preserve">as well as reach ExtremeCloud IQ. This can be done through a proxy. </w:t>
+        <w:t xml:space="preserve">as well as reach </w:t>
+      </w:r>
+      <w:proofErr w:type="spellStart"/>
+      <w:r>
+        <w:rPr>
+          <w:rFonts w:asciiTheme="minorHAnsi" w:hAnsiTheme="minorHAnsi" w:cstheme="minorHAnsi"/>
+        </w:rPr>
+        <w:t>ExtremeCloud</w:t>
+      </w:r>
+      <w:proofErr w:type="spellEnd"/>
+      <w:r>
+        <w:rPr>
+          <w:rFonts w:asciiTheme="minorHAnsi" w:hAnsiTheme="minorHAnsi" w:cstheme="minorHAnsi"/>
+        </w:rPr>
+        <w:t xml:space="preserve"> IQ. This can be done through a proxy. </w:t>
       </w:r>
       <w:r>
         <w:rPr>
@@ -5696,9 +5778,6 @@
         <w:t>ython is to open the terminal (Power Shell on Windows) and type this command.</w:t>
       </w:r>
     </w:p>
-    <w:bookmarkStart w:id="51" w:name="_Toc92701398"/>
-    <w:bookmarkStart w:id="52" w:name="_Toc96008984"/>
-    <w:bookmarkStart w:id="53" w:name="_Toc198280757"/>
     <w:p>
       <w:pPr>
         <w:pStyle w:val="Heading3"/>
@@ -5709,6 +5788,9 @@
           <w:szCs w:val="20"/>
         </w:rPr>
       </w:pPr>
+      <w:bookmarkStart w:id="51" w:name="_Toc92701398"/>
+      <w:bookmarkStart w:id="52" w:name="_Toc96008984"/>
+      <w:bookmarkStart w:id="53" w:name="_Toc198280757"/>
       <w:r>
         <w:rPr>
           <w:noProof/>
@@ -6677,6 +6759,7 @@
       <w:r>
         <w:t>The module is not installed if a ‘</w:t>
       </w:r>
+      <w:proofErr w:type="spellStart"/>
       <w:r>
         <w:rPr>
           <w:rFonts w:ascii="Apple Braille" w:hAnsi="Apple Braille"/>
@@ -6685,7 +6768,18 @@
           <w:sz w:val="20"/>
           <w:szCs w:val="20"/>
         </w:rPr>
-        <w:t>ModuleNotFoundError: No module named '&lt;module name&gt;</w:t>
+        <w:t>ModuleNotFoundError</w:t>
+      </w:r>
+      <w:proofErr w:type="spellEnd"/>
+      <w:r>
+        <w:rPr>
+          <w:rFonts w:ascii="Apple Braille" w:hAnsi="Apple Braille"/>
+          <w:i/>
+          <w:iCs/>
+          <w:sz w:val="20"/>
+          <w:szCs w:val="20"/>
+        </w:rPr>
+        <w:t>: No module named '&lt;module name&gt;</w:t>
       </w:r>
       <w:r>
         <w:t>'</w:t>
@@ -6765,13 +6859,13 @@
         <w:t>.</w:t>
       </w:r>
     </w:p>
-    <w:bookmarkStart w:id="67" w:name="_Toc92701404"/>
-    <w:bookmarkStart w:id="68" w:name="_Toc96008990"/>
-    <w:bookmarkStart w:id="69" w:name="_Toc198280763"/>
     <w:p>
       <w:pPr>
         <w:pStyle w:val="Heading2"/>
       </w:pPr>
+      <w:bookmarkStart w:id="67" w:name="_Toc92701404"/>
+      <w:bookmarkStart w:id="68" w:name="_Toc96008990"/>
+      <w:bookmarkStart w:id="69" w:name="_Toc198280763"/>
       <w:r>
         <w:rPr>
           <w:noProof/>
@@ -7328,13 +7422,23 @@
           <w:rFonts w:cstheme="minorHAnsi"/>
         </w:rPr>
       </w:pPr>
+      <w:proofErr w:type="spellStart"/>
       <w:r>
         <w:rPr>
           <w:rFonts w:cstheme="minorHAnsi"/>
           <w:b/>
           <w:bCs/>
         </w:rPr>
-        <w:t xml:space="preserve">client_id </w:t>
+        <w:t>client_id</w:t>
+      </w:r>
+      <w:proofErr w:type="spellEnd"/>
+      <w:r>
+        <w:rPr>
+          <w:rFonts w:cstheme="minorHAnsi"/>
+          <w:b/>
+          <w:bCs/>
+        </w:rPr>
+        <w:t xml:space="preserve"> </w:t>
       </w:r>
       <w:r>
         <w:rPr>
@@ -7369,13 +7473,23 @@
           <w:rFonts w:cstheme="minorHAnsi"/>
         </w:rPr>
       </w:pPr>
+      <w:proofErr w:type="spellStart"/>
       <w:r>
         <w:rPr>
           <w:rFonts w:cstheme="minorHAnsi"/>
           <w:b/>
           <w:bCs/>
         </w:rPr>
-        <w:t xml:space="preserve">client_secret - </w:t>
+        <w:t>client_secret</w:t>
+      </w:r>
+      <w:proofErr w:type="spellEnd"/>
+      <w:r>
+        <w:rPr>
+          <w:rFonts w:cstheme="minorHAnsi"/>
+          <w:b/>
+          <w:bCs/>
+        </w:rPr>
+        <w:t xml:space="preserve"> - </w:t>
       </w:r>
       <w:r>
         <w:rPr>
@@ -8225,6 +8339,7 @@
         </w:rPr>
         <w:t xml:space="preserve"> change the </w:t>
       </w:r>
+      <w:proofErr w:type="spellStart"/>
       <w:r>
         <w:rPr>
           <w:rFonts w:asciiTheme="minorHAnsi" w:hAnsiTheme="minorHAnsi" w:cstheme="minorHAnsi"/>
@@ -8233,6 +8348,7 @@
         </w:rPr>
         <w:t>PCG_Enable</w:t>
       </w:r>
+      <w:proofErr w:type="spellEnd"/>
       <w:r>
         <w:rPr>
           <w:rFonts w:asciiTheme="minorHAnsi" w:hAnsiTheme="minorHAnsi" w:cstheme="minorHAnsi"/>
@@ -9425,7 +9541,27 @@
           <w:sz w:val="18"/>
           <w:szCs w:val="18"/>
         </w:rPr>
-        <w:t>"password": "changeme"</w:t>
+        <w:t>"password": "</w:t>
+      </w:r>
+      <w:proofErr w:type="spellStart"/>
+      <w:r>
+        <w:rPr>
+          <w:rFonts w:ascii="Cordia New" w:hAnsi="Cordia New" w:cs="Cordia New" w:hint="cs"/>
+          <w:color w:val="FFFFFF" w:themeColor="background1"/>
+          <w:sz w:val="18"/>
+          <w:szCs w:val="18"/>
+        </w:rPr>
+        <w:t>changeme</w:t>
+      </w:r>
+      <w:proofErr w:type="spellEnd"/>
+      <w:r>
+        <w:rPr>
+          <w:rFonts w:ascii="Cordia New" w:hAnsi="Cordia New" w:cs="Cordia New" w:hint="cs"/>
+          <w:color w:val="FFFFFF" w:themeColor="background1"/>
+          <w:sz w:val="18"/>
+          <w:szCs w:val="18"/>
+        </w:rPr>
+        <w:t>"</w:t>
       </w:r>
       <w:r>
         <w:rPr>
@@ -9551,7 +9687,7 @@
           <w:noProof/>
         </w:rPr>
         <w:drawing>
-          <wp:inline distT="0" distB="0" distL="0" distR="0" wp14:anchorId="78A346D3" wp14:editId="64A72F80">
+          <wp:inline distT="0" distB="0" distL="0" distR="0" wp14:anchorId="78A346D3" wp14:editId="3424BCE7">
             <wp:extent cx="5012055" cy="637292"/>
             <wp:effectExtent l="0" t="0" r="0" b="0"/>
             <wp:docPr id="5" name="Picture 5" descr="Graphical user interface, text, application&#10;&#10;Description automatically generated"/>
@@ -9647,8 +9783,16 @@
         <w:rPr>
           <w:rFonts w:ascii="Calibri" w:hAnsi="Calibri" w:cs="Calibri"/>
         </w:rPr>
-        <w:t xml:space="preserve"> not including the “”s.</w:t>
-      </w:r>
+        <w:t xml:space="preserve"> not including the </w:t>
+      </w:r>
+      <w:proofErr w:type="gramStart"/>
+      <w:r>
+        <w:rPr>
+          <w:rFonts w:ascii="Calibri" w:hAnsi="Calibri" w:cs="Calibri"/>
+        </w:rPr>
+        <w:t>“”s.</w:t>
+      </w:r>
+      <w:proofErr w:type="gramEnd"/>
     </w:p>
     <w:p>
       <w:pPr>
@@ -10027,17 +10171,26 @@
         </w:rPr>
         <w:t xml:space="preserve"> we will want to have the following permissions - </w:t>
       </w:r>
+      <w:proofErr w:type="spellStart"/>
       <w:r>
         <w:rPr>
           <w:rFonts w:asciiTheme="minorHAnsi" w:hAnsiTheme="minorHAnsi" w:cstheme="minorHAnsi"/>
         </w:rPr>
         <w:t>enduser</w:t>
       </w:r>
-      <w:r>
-        <w:rPr>
-          <w:rFonts w:asciiTheme="minorHAnsi" w:hAnsiTheme="minorHAnsi" w:cstheme="minorHAnsi"/>
-        </w:rPr>
-        <w:t>, pcg</w:t>
+      <w:proofErr w:type="spellEnd"/>
+      <w:r>
+        <w:rPr>
+          <w:rFonts w:asciiTheme="minorHAnsi" w:hAnsiTheme="minorHAnsi" w:cstheme="minorHAnsi"/>
+        </w:rPr>
+        <w:t xml:space="preserve">, </w:t>
+      </w:r>
+      <w:proofErr w:type="spellStart"/>
+      <w:r>
+        <w:rPr>
+          <w:rFonts w:asciiTheme="minorHAnsi" w:hAnsiTheme="minorHAnsi" w:cstheme="minorHAnsi"/>
+        </w:rPr>
+        <w:t>pcg</w:t>
       </w:r>
       <w:r>
         <w:rPr>
@@ -10051,6 +10204,7 @@
         </w:rPr>
         <w:t>key</w:t>
       </w:r>
+      <w:proofErr w:type="spellEnd"/>
       <w:r>
         <w:rPr>
           <w:rFonts w:asciiTheme="minorHAnsi" w:hAnsiTheme="minorHAnsi" w:cstheme="minorHAnsi"/>
@@ -10062,7 +10216,21 @@
           <w:rFonts w:asciiTheme="minorHAnsi" w:hAnsiTheme="minorHAnsi" w:cstheme="minorHAnsi"/>
         </w:rPr>
         <w:br/>
-        <w:t xml:space="preserve">This will give us access to view, create, and delete ppsk users </w:t>
+        <w:t xml:space="preserve">This will give us access to view, create, and delete </w:t>
+      </w:r>
+      <w:proofErr w:type="spellStart"/>
+      <w:r>
+        <w:rPr>
+          <w:rFonts w:asciiTheme="minorHAnsi" w:hAnsiTheme="minorHAnsi" w:cstheme="minorHAnsi"/>
+        </w:rPr>
+        <w:t>ppsk</w:t>
+      </w:r>
+      <w:proofErr w:type="spellEnd"/>
+      <w:r>
+        <w:rPr>
+          <w:rFonts w:asciiTheme="minorHAnsi" w:hAnsiTheme="minorHAnsi" w:cstheme="minorHAnsi"/>
+        </w:rPr>
+        <w:t xml:space="preserve"> users </w:t>
       </w:r>
       <w:r>
         <w:rPr>
@@ -10092,7 +10260,21 @@
         <w:rPr>
           <w:rFonts w:asciiTheme="minorHAnsi" w:hAnsiTheme="minorHAnsi" w:cstheme="minorHAnsi"/>
         </w:rPr>
-        <w:t>create, and delete pcg-key-based users if necessary.</w:t>
+        <w:t xml:space="preserve">create, and delete </w:t>
+      </w:r>
+      <w:proofErr w:type="spellStart"/>
+      <w:r>
+        <w:rPr>
+          <w:rFonts w:asciiTheme="minorHAnsi" w:hAnsiTheme="minorHAnsi" w:cstheme="minorHAnsi"/>
+        </w:rPr>
+        <w:t>pcg</w:t>
+      </w:r>
+      <w:proofErr w:type="spellEnd"/>
+      <w:r>
+        <w:rPr>
+          <w:rFonts w:asciiTheme="minorHAnsi" w:hAnsiTheme="minorHAnsi" w:cstheme="minorHAnsi"/>
+        </w:rPr>
+        <w:t>-key-based users if necessary.</w:t>
       </w:r>
       <w:r>
         <w:rPr>
@@ -10236,6 +10418,7 @@
         </w:rPr>
         <w:t xml:space="preserve">  "description": "Token for </w:t>
       </w:r>
+      <w:proofErr w:type="gramStart"/>
       <w:r>
         <w:rPr>
           <w:rFonts w:ascii="Cordia New" w:hAnsi="Cordia New" w:cs="Cordia New"/>
@@ -10254,6 +10437,7 @@
         </w:rPr>
         <w:t xml:space="preserve"> script</w:t>
       </w:r>
+      <w:proofErr w:type="gramEnd"/>
       <w:r>
         <w:rPr>
           <w:rFonts w:ascii="Cordia New" w:hAnsi="Cordia New" w:cs="Cordia New" w:hint="cs"/>
@@ -10279,7 +10463,27 @@
           <w:sz w:val="15"/>
           <w:szCs w:val="15"/>
         </w:rPr>
-        <w:t xml:space="preserve">  "expire_time": </w:t>
+        <w:t xml:space="preserve">  "</w:t>
+      </w:r>
+      <w:proofErr w:type="spellStart"/>
+      <w:r>
+        <w:rPr>
+          <w:rFonts w:ascii="Cordia New" w:hAnsi="Cordia New" w:cs="Cordia New" w:hint="cs"/>
+          <w:color w:val="FFFFFF" w:themeColor="background1"/>
+          <w:sz w:val="15"/>
+          <w:szCs w:val="15"/>
+        </w:rPr>
+        <w:t>expire_time</w:t>
+      </w:r>
+      <w:proofErr w:type="spellEnd"/>
+      <w:r>
+        <w:rPr>
+          <w:rFonts w:ascii="Cordia New" w:hAnsi="Cordia New" w:cs="Cordia New" w:hint="cs"/>
+          <w:color w:val="FFFFFF" w:themeColor="background1"/>
+          <w:sz w:val="15"/>
+          <w:szCs w:val="15"/>
+        </w:rPr>
+        <w:t xml:space="preserve">": </w:t>
       </w:r>
       <w:r>
         <w:rPr>
@@ -10336,6 +10540,7 @@
         </w:rPr>
         <w:t xml:space="preserve">  "</w:t>
       </w:r>
+      <w:proofErr w:type="spellStart"/>
       <w:r>
         <w:rPr>
           <w:rFonts w:ascii="Cordia New" w:hAnsi="Cordia New" w:cs="Cordia New"/>
@@ -10343,8 +10548,9 @@
           <w:sz w:val="15"/>
           <w:szCs w:val="15"/>
         </w:rPr>
-        <w:t>enduser”,</w:t>
-      </w:r>
+        <w:t>enduser</w:t>
+      </w:r>
+      <w:proofErr w:type="spellEnd"/>
       <w:r>
         <w:rPr>
           <w:rFonts w:ascii="Cordia New" w:hAnsi="Cordia New" w:cs="Cordia New"/>
@@ -10352,8 +10558,37 @@
           <w:sz w:val="15"/>
           <w:szCs w:val="15"/>
         </w:rPr>
+        <w:t>”,</w:t>
+      </w:r>
+      <w:r>
+        <w:rPr>
+          <w:rFonts w:ascii="Cordia New" w:hAnsi="Cordia New" w:cs="Cordia New"/>
+          <w:color w:val="FFFFFF" w:themeColor="background1"/>
+          <w:sz w:val="15"/>
+          <w:szCs w:val="15"/>
+        </w:rPr>
         <w:br/>
-        <w:t xml:space="preserve">  “pcg:key”</w:t>
+        <w:t xml:space="preserve">  “</w:t>
+      </w:r>
+      <w:proofErr w:type="spellStart"/>
+      <w:r>
+        <w:rPr>
+          <w:rFonts w:ascii="Cordia New" w:hAnsi="Cordia New" w:cs="Cordia New"/>
+          <w:color w:val="FFFFFF" w:themeColor="background1"/>
+          <w:sz w:val="15"/>
+          <w:szCs w:val="15"/>
+        </w:rPr>
+        <w:t>pcg:key</w:t>
+      </w:r>
+      <w:proofErr w:type="spellEnd"/>
+      <w:r>
+        <w:rPr>
+          <w:rFonts w:ascii="Cordia New" w:hAnsi="Cordia New" w:cs="Cordia New"/>
+          <w:color w:val="FFFFFF" w:themeColor="background1"/>
+          <w:sz w:val="15"/>
+          <w:szCs w:val="15"/>
+        </w:rPr>
+        <w:t>”</w:t>
       </w:r>
       <w:r>
         <w:rPr>
@@ -10493,7 +10728,47 @@
           <w:sz w:val="18"/>
           <w:szCs w:val="18"/>
         </w:rPr>
-        <w:t>"access_token"</w:t>
+        <w:t>"</w:t>
+      </w:r>
+      <w:proofErr w:type="spellStart"/>
+      <w:proofErr w:type="gramStart"/>
+      <w:r>
+        <w:rPr>
+          <w:rStyle w:val="hljs-attr"/>
+          <w:rFonts w:ascii="Cordia New" w:hAnsi="Cordia New" w:cs="Cordia New" w:hint="cs"/>
+          <w:b/>
+          <w:bCs/>
+          <w:color w:val="FFFFFF"/>
+          <w:sz w:val="18"/>
+          <w:szCs w:val="18"/>
+        </w:rPr>
+        <w:t>access</w:t>
+      </w:r>
+      <w:proofErr w:type="gramEnd"/>
+      <w:r>
+        <w:rPr>
+          <w:rStyle w:val="hljs-attr"/>
+          <w:rFonts w:ascii="Cordia New" w:hAnsi="Cordia New" w:cs="Cordia New" w:hint="cs"/>
+          <w:b/>
+          <w:bCs/>
+          <w:color w:val="FFFFFF"/>
+          <w:sz w:val="18"/>
+          <w:szCs w:val="18"/>
+        </w:rPr>
+        <w:t>_token</w:t>
+      </w:r>
+      <w:proofErr w:type="spellEnd"/>
+      <w:r>
+        <w:rPr>
+          <w:rStyle w:val="hljs-attr"/>
+          <w:rFonts w:ascii="Cordia New" w:hAnsi="Cordia New" w:cs="Cordia New" w:hint="cs"/>
+          <w:b/>
+          <w:bCs/>
+          <w:color w:val="FFFFFF"/>
+          <w:sz w:val="18"/>
+          <w:szCs w:val="18"/>
+        </w:rPr>
+        <w:t>"</w:t>
       </w:r>
       <w:r>
         <w:rPr>
@@ -10568,7 +10843,47 @@
           <w:sz w:val="18"/>
           <w:szCs w:val="18"/>
         </w:rPr>
-        <w:t>"create_time"</w:t>
+        <w:t>"</w:t>
+      </w:r>
+      <w:proofErr w:type="spellStart"/>
+      <w:proofErr w:type="gramStart"/>
+      <w:r>
+        <w:rPr>
+          <w:rStyle w:val="hljs-attr"/>
+          <w:rFonts w:ascii="Cordia New" w:hAnsi="Cordia New" w:cs="Cordia New" w:hint="cs"/>
+          <w:b/>
+          <w:bCs/>
+          <w:color w:val="FFFFFF"/>
+          <w:sz w:val="18"/>
+          <w:szCs w:val="18"/>
+        </w:rPr>
+        <w:t>create</w:t>
+      </w:r>
+      <w:proofErr w:type="gramEnd"/>
+      <w:r>
+        <w:rPr>
+          <w:rStyle w:val="hljs-attr"/>
+          <w:rFonts w:ascii="Cordia New" w:hAnsi="Cordia New" w:cs="Cordia New" w:hint="cs"/>
+          <w:b/>
+          <w:bCs/>
+          <w:color w:val="FFFFFF"/>
+          <w:sz w:val="18"/>
+          <w:szCs w:val="18"/>
+        </w:rPr>
+        <w:t>_time</w:t>
+      </w:r>
+      <w:proofErr w:type="spellEnd"/>
+      <w:r>
+        <w:rPr>
+          <w:rStyle w:val="hljs-attr"/>
+          <w:rFonts w:ascii="Cordia New" w:hAnsi="Cordia New" w:cs="Cordia New" w:hint="cs"/>
+          <w:b/>
+          <w:bCs/>
+          <w:color w:val="FFFFFF"/>
+          <w:sz w:val="18"/>
+          <w:szCs w:val="18"/>
+        </w:rPr>
+        <w:t>"</w:t>
       </w:r>
       <w:r>
         <w:rPr>
@@ -10763,7 +11078,47 @@
           <w:sz w:val="18"/>
           <w:szCs w:val="18"/>
         </w:rPr>
-        <w:t>"expire_time"</w:t>
+        <w:t>"</w:t>
+      </w:r>
+      <w:proofErr w:type="spellStart"/>
+      <w:proofErr w:type="gramStart"/>
+      <w:r>
+        <w:rPr>
+          <w:rStyle w:val="hljs-attr"/>
+          <w:rFonts w:ascii="Cordia New" w:hAnsi="Cordia New" w:cs="Cordia New" w:hint="cs"/>
+          <w:b/>
+          <w:bCs/>
+          <w:color w:val="FFFFFF"/>
+          <w:sz w:val="18"/>
+          <w:szCs w:val="18"/>
+        </w:rPr>
+        <w:t>expire</w:t>
+      </w:r>
+      <w:proofErr w:type="gramEnd"/>
+      <w:r>
+        <w:rPr>
+          <w:rStyle w:val="hljs-attr"/>
+          <w:rFonts w:ascii="Cordia New" w:hAnsi="Cordia New" w:cs="Cordia New" w:hint="cs"/>
+          <w:b/>
+          <w:bCs/>
+          <w:color w:val="FFFFFF"/>
+          <w:sz w:val="18"/>
+          <w:szCs w:val="18"/>
+        </w:rPr>
+        <w:t>_time</w:t>
+      </w:r>
+      <w:proofErr w:type="spellEnd"/>
+      <w:r>
+        <w:rPr>
+          <w:rStyle w:val="hljs-attr"/>
+          <w:rFonts w:ascii="Cordia New" w:hAnsi="Cordia New" w:cs="Cordia New" w:hint="cs"/>
+          <w:b/>
+          <w:bCs/>
+          <w:color w:val="FFFFFF"/>
+          <w:sz w:val="18"/>
+          <w:szCs w:val="18"/>
+        </w:rPr>
+        <w:t>"</w:t>
       </w:r>
       <w:r>
         <w:rPr>
@@ -10958,7 +11313,47 @@
           <w:sz w:val="18"/>
           <w:szCs w:val="18"/>
         </w:rPr>
-        <w:t>"creator_id"</w:t>
+        <w:t>"</w:t>
+      </w:r>
+      <w:proofErr w:type="spellStart"/>
+      <w:proofErr w:type="gramStart"/>
+      <w:r>
+        <w:rPr>
+          <w:rStyle w:val="hljs-attr"/>
+          <w:rFonts w:ascii="Cordia New" w:hAnsi="Cordia New" w:cs="Cordia New" w:hint="cs"/>
+          <w:b/>
+          <w:bCs/>
+          <w:color w:val="FFFFFF"/>
+          <w:sz w:val="18"/>
+          <w:szCs w:val="18"/>
+        </w:rPr>
+        <w:t>creator</w:t>
+      </w:r>
+      <w:proofErr w:type="gramEnd"/>
+      <w:r>
+        <w:rPr>
+          <w:rStyle w:val="hljs-attr"/>
+          <w:rFonts w:ascii="Cordia New" w:hAnsi="Cordia New" w:cs="Cordia New" w:hint="cs"/>
+          <w:b/>
+          <w:bCs/>
+          <w:color w:val="FFFFFF"/>
+          <w:sz w:val="18"/>
+          <w:szCs w:val="18"/>
+        </w:rPr>
+        <w:t>_id</w:t>
+      </w:r>
+      <w:proofErr w:type="spellEnd"/>
+      <w:r>
+        <w:rPr>
+          <w:rStyle w:val="hljs-attr"/>
+          <w:rFonts w:ascii="Cordia New" w:hAnsi="Cordia New" w:cs="Cordia New" w:hint="cs"/>
+          <w:b/>
+          <w:bCs/>
+          <w:color w:val="FFFFFF"/>
+          <w:sz w:val="18"/>
+          <w:szCs w:val="18"/>
+        </w:rPr>
+        <w:t>"</w:t>
       </w:r>
       <w:r>
         <w:rPr>
@@ -11033,7 +11428,47 @@
           <w:sz w:val="18"/>
           <w:szCs w:val="18"/>
         </w:rPr>
-        <w:t>"customer_id"</w:t>
+        <w:t>"</w:t>
+      </w:r>
+      <w:proofErr w:type="spellStart"/>
+      <w:proofErr w:type="gramStart"/>
+      <w:r>
+        <w:rPr>
+          <w:rStyle w:val="hljs-attr"/>
+          <w:rFonts w:ascii="Cordia New" w:hAnsi="Cordia New" w:cs="Cordia New" w:hint="cs"/>
+          <w:b/>
+          <w:bCs/>
+          <w:color w:val="FFFFFF"/>
+          <w:sz w:val="18"/>
+          <w:szCs w:val="18"/>
+        </w:rPr>
+        <w:t>customer</w:t>
+      </w:r>
+      <w:proofErr w:type="gramEnd"/>
+      <w:r>
+        <w:rPr>
+          <w:rStyle w:val="hljs-attr"/>
+          <w:rFonts w:ascii="Cordia New" w:hAnsi="Cordia New" w:cs="Cordia New" w:hint="cs"/>
+          <w:b/>
+          <w:bCs/>
+          <w:color w:val="FFFFFF"/>
+          <w:sz w:val="18"/>
+          <w:szCs w:val="18"/>
+        </w:rPr>
+        <w:t>_id</w:t>
+      </w:r>
+      <w:proofErr w:type="spellEnd"/>
+      <w:r>
+        <w:rPr>
+          <w:rStyle w:val="hljs-attr"/>
+          <w:rFonts w:ascii="Cordia New" w:hAnsi="Cordia New" w:cs="Cordia New" w:hint="cs"/>
+          <w:b/>
+          <w:bCs/>
+          <w:color w:val="FFFFFF"/>
+          <w:sz w:val="18"/>
+          <w:szCs w:val="18"/>
+        </w:rPr>
+        <w:t>"</w:t>
       </w:r>
       <w:r>
         <w:rPr>
@@ -11220,6 +11655,7 @@
         </w:rPr>
         <w:t>"</w:t>
       </w:r>
+      <w:proofErr w:type="spellStart"/>
       <w:r>
         <w:rPr>
           <w:rFonts w:ascii="Cordia New" w:hAnsi="Cordia New" w:cs="Cordia New"/>
@@ -11231,6 +11667,7 @@
         </w:rPr>
         <w:t>enduser</w:t>
       </w:r>
+      <w:proofErr w:type="spellEnd"/>
       <w:r>
         <w:rPr>
           <w:rFonts w:ascii="Cordia New" w:hAnsi="Cordia New" w:cs="Cordia New" w:hint="cs"/>
@@ -11304,8 +11741,22 @@
           <w:sz w:val="18"/>
           <w:szCs w:val="18"/>
         </w:rPr>
-        <w:t>"pcg</w:t>
-      </w:r>
+        <w:t>"</w:t>
+      </w:r>
+      <w:proofErr w:type="spellStart"/>
+      <w:proofErr w:type="gramStart"/>
+      <w:r>
+        <w:rPr>
+          <w:rFonts w:ascii="Cordia New" w:hAnsi="Cordia New" w:cs="Cordia New" w:hint="cs"/>
+          <w:b/>
+          <w:bCs/>
+          <w:color w:val="A2FCA2"/>
+          <w:sz w:val="18"/>
+          <w:szCs w:val="18"/>
+        </w:rPr>
+        <w:t>pcg</w:t>
+      </w:r>
+      <w:proofErr w:type="gramEnd"/>
       <w:r>
         <w:rPr>
           <w:rFonts w:ascii="Cordia New" w:hAnsi="Cordia New" w:cs="Cordia New"/>
@@ -11317,6 +11768,7 @@
         </w:rPr>
         <w:t>:key</w:t>
       </w:r>
+      <w:proofErr w:type="spellEnd"/>
       <w:r>
         <w:rPr>
           <w:rFonts w:ascii="Cordia New" w:hAnsi="Cordia New" w:cs="Cordia New" w:hint="cs"/>
@@ -11417,7 +11869,35 @@
         <w:rPr>
           <w:rFonts w:asciiTheme="minorHAnsi" w:hAnsiTheme="minorHAnsi" w:cstheme="minorHAnsi"/>
         </w:rPr>
-        <w:t>Copy the newly created access_token and add it to the XIQ_token variable in the script.</w:t>
+        <w:t xml:space="preserve">Copy the newly created </w:t>
+      </w:r>
+      <w:proofErr w:type="spellStart"/>
+      <w:r>
+        <w:rPr>
+          <w:rFonts w:asciiTheme="minorHAnsi" w:hAnsiTheme="minorHAnsi" w:cstheme="minorHAnsi"/>
+        </w:rPr>
+        <w:t>access_token</w:t>
+      </w:r>
+      <w:proofErr w:type="spellEnd"/>
+      <w:r>
+        <w:rPr>
+          <w:rFonts w:asciiTheme="minorHAnsi" w:hAnsiTheme="minorHAnsi" w:cstheme="minorHAnsi"/>
+        </w:rPr>
+        <w:t xml:space="preserve"> and add it to the </w:t>
+      </w:r>
+      <w:proofErr w:type="spellStart"/>
+      <w:r>
+        <w:rPr>
+          <w:rFonts w:asciiTheme="minorHAnsi" w:hAnsiTheme="minorHAnsi" w:cstheme="minorHAnsi"/>
+        </w:rPr>
+        <w:t>XIQ_token</w:t>
+      </w:r>
+      <w:proofErr w:type="spellEnd"/>
+      <w:r>
+        <w:rPr>
+          <w:rFonts w:asciiTheme="minorHAnsi" w:hAnsiTheme="minorHAnsi" w:cstheme="minorHAnsi"/>
+        </w:rPr>
+        <w:t xml:space="preserve"> variable in the script.</w:t>
       </w:r>
     </w:p>
     <w:p>
@@ -11814,7 +12294,7 @@
           <w:noProof/>
         </w:rPr>
         <w:drawing>
-          <wp:inline distT="0" distB="0" distL="0" distR="0" wp14:anchorId="6AC2AFD5" wp14:editId="3B39450D">
+          <wp:inline distT="0" distB="0" distL="0" distR="0" wp14:anchorId="6AC2AFD5" wp14:editId="654C1DEB">
             <wp:extent cx="3004522" cy="1629446"/>
             <wp:effectExtent l="0" t="0" r="5715" b="0"/>
             <wp:docPr id="14" name="Picture 14"/>
@@ -11961,7 +12441,7 @@
           <w:noProof/>
         </w:rPr>
         <w:drawing>
-          <wp:inline distT="0" distB="0" distL="0" distR="0" wp14:anchorId="57640B61" wp14:editId="4BBA0AB3">
+          <wp:inline distT="0" distB="0" distL="0" distR="0" wp14:anchorId="57640B61" wp14:editId="0F9BC11D">
             <wp:extent cx="6492240" cy="2078355"/>
             <wp:effectExtent l="0" t="0" r="0" b="4445"/>
             <wp:docPr id="15" name="Picture 15" descr="Graphical user interface, application, Teams&#10;&#10;Description automatically generated"/>
@@ -12184,7 +12664,25 @@
           <w:b/>
           <w:bCs/>
         </w:rPr>
-        <w:t>‘Group.Read.All’</w:t>
+        <w:t>‘</w:t>
+      </w:r>
+      <w:proofErr w:type="spellStart"/>
+      <w:proofErr w:type="gramStart"/>
+      <w:r>
+        <w:rPr>
+          <w:b/>
+          <w:bCs/>
+        </w:rPr>
+        <w:t>Group.Read.All</w:t>
+      </w:r>
+      <w:proofErr w:type="spellEnd"/>
+      <w:proofErr w:type="gramEnd"/>
+      <w:r>
+        <w:rPr>
+          <w:b/>
+          <w:bCs/>
+        </w:rPr>
+        <w:t>’</w:t>
       </w:r>
       <w:r>
         <w:t xml:space="preserve">, and click </w:t>
@@ -12225,7 +12723,25 @@
           <w:b/>
           <w:bCs/>
         </w:rPr>
-        <w:t>‘User.Read.All’</w:t>
+        <w:t>‘</w:t>
+      </w:r>
+      <w:proofErr w:type="spellStart"/>
+      <w:proofErr w:type="gramStart"/>
+      <w:r>
+        <w:rPr>
+          <w:b/>
+          <w:bCs/>
+        </w:rPr>
+        <w:t>User.Read.All</w:t>
+      </w:r>
+      <w:proofErr w:type="spellEnd"/>
+      <w:proofErr w:type="gramEnd"/>
+      <w:r>
+        <w:rPr>
+          <w:b/>
+          <w:bCs/>
+        </w:rPr>
+        <w:t>’</w:t>
       </w:r>
       <w:r>
         <w:t xml:space="preserve"> to grant access </w:t>
@@ -12243,7 +12759,7 @@
           <w:noProof/>
         </w:rPr>
         <w:drawing>
-          <wp:anchor distT="0" distB="0" distL="114300" distR="114300" simplePos="0" relativeHeight="251688960" behindDoc="1" locked="0" layoutInCell="1" allowOverlap="1" wp14:anchorId="5DC2787C" wp14:editId="58AEFA02">
+          <wp:anchor distT="0" distB="0" distL="114300" distR="114300" simplePos="0" relativeHeight="251688960" behindDoc="1" locked="0" layoutInCell="1" allowOverlap="1" wp14:anchorId="5DC2787C" wp14:editId="31AB31A1">
             <wp:simplePos x="0" y="0"/>
             <wp:positionH relativeFrom="column">
               <wp:posOffset>4667250</wp:posOffset>
@@ -12371,7 +12887,25 @@
           <w:b/>
           <w:bCs/>
         </w:rPr>
-        <w:t>‘User.Read.All’</w:t>
+        <w:t>‘</w:t>
+      </w:r>
+      <w:proofErr w:type="spellStart"/>
+      <w:proofErr w:type="gramStart"/>
+      <w:r>
+        <w:rPr>
+          <w:b/>
+          <w:bCs/>
+        </w:rPr>
+        <w:t>User.Read.All</w:t>
+      </w:r>
+      <w:proofErr w:type="spellEnd"/>
+      <w:proofErr w:type="gramEnd"/>
+      <w:r>
+        <w:rPr>
+          <w:b/>
+          <w:bCs/>
+        </w:rPr>
+        <w:t>’</w:t>
       </w:r>
       <w:r>
         <w:t xml:space="preserve">, and clicking </w:t>
@@ -12593,7 +13127,15 @@
         <w:t>‘Client secrets’</w:t>
       </w:r>
       <w:r>
-        <w:t xml:space="preserve"> tab, and select the </w:t>
+        <w:t xml:space="preserve"> </w:t>
+      </w:r>
+      <w:proofErr w:type="gramStart"/>
+      <w:r>
+        <w:t>tab, and</w:t>
+      </w:r>
+      <w:proofErr w:type="gramEnd"/>
+      <w:r>
+        <w:t xml:space="preserve"> select the </w:t>
       </w:r>
       <w:r>
         <w:rPr>
@@ -12900,7 +13442,15 @@
         <w:t>to</w:t>
       </w:r>
       <w:r>
-        <w:t xml:space="preserve"> the group_roles object in the script</w:t>
+        <w:t xml:space="preserve"> the </w:t>
+      </w:r>
+      <w:proofErr w:type="spellStart"/>
+      <w:r>
+        <w:t>group_roles</w:t>
+      </w:r>
+      <w:proofErr w:type="spellEnd"/>
+      <w:r>
+        <w:t xml:space="preserve"> object in the script</w:t>
       </w:r>
       <w:r>
         <w:t>.</w:t>
@@ -12957,6 +13507,7 @@
           <w:szCs w:val="18"/>
         </w:rPr>
       </w:pPr>
+      <w:proofErr w:type="spellStart"/>
       <w:r>
         <w:rPr>
           <w:rFonts w:ascii="Cordia New" w:hAnsi="Cordia New" w:cs="Cordia New" w:hint="cs"/>
@@ -12964,7 +13515,17 @@
           <w:sz w:val="18"/>
           <w:szCs w:val="18"/>
         </w:rPr>
-        <w:t>group_roles = [</w:t>
+        <w:t>group_roles</w:t>
+      </w:r>
+      <w:proofErr w:type="spellEnd"/>
+      <w:r>
+        <w:rPr>
+          <w:rFonts w:ascii="Cordia New" w:hAnsi="Cordia New" w:cs="Cordia New" w:hint="cs"/>
+          <w:color w:val="D3D0C8"/>
+          <w:sz w:val="18"/>
+          <w:szCs w:val="18"/>
+        </w:rPr>
+        <w:t xml:space="preserve"> = [</w:t>
       </w:r>
     </w:p>
     <w:p>
@@ -13285,7 +13846,25 @@
           <w:i/>
           <w:iCs/>
         </w:rPr>
-        <w:t xml:space="preserve">/usergroups </w:t>
+        <w:t>/</w:t>
+      </w:r>
+      <w:proofErr w:type="spellStart"/>
+      <w:r>
+        <w:rPr>
+          <w:rFonts w:asciiTheme="minorHAnsi" w:hAnsiTheme="minorHAnsi" w:cstheme="minorHAnsi"/>
+          <w:i/>
+          <w:iCs/>
+        </w:rPr>
+        <w:t>usergroups</w:t>
+      </w:r>
+      <w:proofErr w:type="spellEnd"/>
+      <w:r>
+        <w:rPr>
+          <w:rFonts w:asciiTheme="minorHAnsi" w:hAnsiTheme="minorHAnsi" w:cstheme="minorHAnsi"/>
+          <w:i/>
+          <w:iCs/>
+        </w:rPr>
+        <w:t xml:space="preserve"> </w:t>
       </w:r>
       <w:r>
         <w:rPr>
@@ -13306,7 +13885,7 @@
           <w:noProof/>
         </w:rPr>
         <w:drawing>
-          <wp:inline distT="0" distB="0" distL="0" distR="0" wp14:anchorId="037834AB" wp14:editId="5F3A3FD0">
+          <wp:inline distT="0" distB="0" distL="0" distR="0" wp14:anchorId="037834AB" wp14:editId="101FDE98">
             <wp:extent cx="6492240" cy="248285"/>
             <wp:effectExtent l="0" t="0" r="0" b="5715"/>
             <wp:docPr id="13" name="Picture 13"/>
@@ -13873,7 +14452,33 @@
           <w:sz w:val="18"/>
           <w:szCs w:val="18"/>
         </w:rPr>
-        <w:t>"Home_Hive"</w:t>
+        <w:t>"</w:t>
+      </w:r>
+      <w:proofErr w:type="spellStart"/>
+      <w:r>
+        <w:rPr>
+          <w:rStyle w:val="HTMLCode"/>
+          <w:rFonts w:ascii="Cordia New" w:hAnsi="Cordia New" w:cs="Cordia New" w:hint="cs"/>
+          <w:b/>
+          <w:bCs/>
+          <w:color w:val="A2FCA2"/>
+          <w:sz w:val="18"/>
+          <w:szCs w:val="18"/>
+        </w:rPr>
+        <w:t>Home_Hive</w:t>
+      </w:r>
+      <w:proofErr w:type="spellEnd"/>
+      <w:r>
+        <w:rPr>
+          <w:rStyle w:val="HTMLCode"/>
+          <w:rFonts w:ascii="Cordia New" w:hAnsi="Cordia New" w:cs="Cordia New" w:hint="cs"/>
+          <w:b/>
+          <w:bCs/>
+          <w:color w:val="A2FCA2"/>
+          <w:sz w:val="18"/>
+          <w:szCs w:val="18"/>
+        </w:rPr>
+        <w:t>"</w:t>
       </w:r>
       <w:r>
         <w:rPr>
@@ -14074,7 +14679,47 @@
           <w:sz w:val="18"/>
           <w:szCs w:val="18"/>
         </w:rPr>
-        <w:t>"create_time"</w:t>
+        <w:t>"</w:t>
+      </w:r>
+      <w:proofErr w:type="spellStart"/>
+      <w:proofErr w:type="gramStart"/>
+      <w:r>
+        <w:rPr>
+          <w:rStyle w:val="hljs-attr"/>
+          <w:rFonts w:ascii="Cordia New" w:hAnsi="Cordia New" w:cs="Cordia New" w:hint="cs"/>
+          <w:b/>
+          <w:bCs/>
+          <w:color w:val="FFFFFF"/>
+          <w:sz w:val="18"/>
+          <w:szCs w:val="18"/>
+        </w:rPr>
+        <w:t>create</w:t>
+      </w:r>
+      <w:proofErr w:type="gramEnd"/>
+      <w:r>
+        <w:rPr>
+          <w:rStyle w:val="hljs-attr"/>
+          <w:rFonts w:ascii="Cordia New" w:hAnsi="Cordia New" w:cs="Cordia New" w:hint="cs"/>
+          <w:b/>
+          <w:bCs/>
+          <w:color w:val="FFFFFF"/>
+          <w:sz w:val="18"/>
+          <w:szCs w:val="18"/>
+        </w:rPr>
+        <w:t>_time</w:t>
+      </w:r>
+      <w:proofErr w:type="spellEnd"/>
+      <w:r>
+        <w:rPr>
+          <w:rStyle w:val="hljs-attr"/>
+          <w:rFonts w:ascii="Cordia New" w:hAnsi="Cordia New" w:cs="Cordia New" w:hint="cs"/>
+          <w:b/>
+          <w:bCs/>
+          <w:color w:val="FFFFFF"/>
+          <w:sz w:val="18"/>
+          <w:szCs w:val="18"/>
+        </w:rPr>
+        <w:t>"</w:t>
       </w:r>
       <w:r>
         <w:rPr>
@@ -14149,7 +14794,47 @@
           <w:sz w:val="18"/>
           <w:szCs w:val="18"/>
         </w:rPr>
-        <w:t>"update_time"</w:t>
+        <w:t>"</w:t>
+      </w:r>
+      <w:proofErr w:type="spellStart"/>
+      <w:proofErr w:type="gramStart"/>
+      <w:r>
+        <w:rPr>
+          <w:rStyle w:val="hljs-attr"/>
+          <w:rFonts w:ascii="Cordia New" w:hAnsi="Cordia New" w:cs="Cordia New" w:hint="cs"/>
+          <w:b/>
+          <w:bCs/>
+          <w:color w:val="FFFFFF"/>
+          <w:sz w:val="18"/>
+          <w:szCs w:val="18"/>
+        </w:rPr>
+        <w:t>update</w:t>
+      </w:r>
+      <w:proofErr w:type="gramEnd"/>
+      <w:r>
+        <w:rPr>
+          <w:rStyle w:val="hljs-attr"/>
+          <w:rFonts w:ascii="Cordia New" w:hAnsi="Cordia New" w:cs="Cordia New" w:hint="cs"/>
+          <w:b/>
+          <w:bCs/>
+          <w:color w:val="FFFFFF"/>
+          <w:sz w:val="18"/>
+          <w:szCs w:val="18"/>
+        </w:rPr>
+        <w:t>_time</w:t>
+      </w:r>
+      <w:proofErr w:type="spellEnd"/>
+      <w:r>
+        <w:rPr>
+          <w:rStyle w:val="hljs-attr"/>
+          <w:rFonts w:ascii="Cordia New" w:hAnsi="Cordia New" w:cs="Cordia New" w:hint="cs"/>
+          <w:b/>
+          <w:bCs/>
+          <w:color w:val="FFFFFF"/>
+          <w:sz w:val="18"/>
+          <w:szCs w:val="18"/>
+        </w:rPr>
+        <w:t>"</w:t>
       </w:r>
       <w:r>
         <w:rPr>
@@ -14248,7 +14933,21 @@
         <w:rPr>
           <w:rFonts w:asciiTheme="minorHAnsi" w:hAnsiTheme="minorHAnsi" w:cstheme="minorHAnsi"/>
         </w:rPr>
-        <w:t xml:space="preserve"> the group_roles object in the script.</w:t>
+        <w:t xml:space="preserve"> the </w:t>
+      </w:r>
+      <w:proofErr w:type="spellStart"/>
+      <w:r>
+        <w:rPr>
+          <w:rFonts w:asciiTheme="minorHAnsi" w:hAnsiTheme="minorHAnsi" w:cstheme="minorHAnsi"/>
+        </w:rPr>
+        <w:t>group_roles</w:t>
+      </w:r>
+      <w:proofErr w:type="spellEnd"/>
+      <w:r>
+        <w:rPr>
+          <w:rFonts w:asciiTheme="minorHAnsi" w:hAnsiTheme="minorHAnsi" w:cstheme="minorHAnsi"/>
+        </w:rPr>
+        <w:t xml:space="preserve"> object in the script.</w:t>
       </w:r>
     </w:p>
     <w:p>
@@ -14260,13 +14959,23 @@
           <w:szCs w:val="18"/>
         </w:rPr>
       </w:pPr>
-      <w:r>
-        <w:rPr>
-          <w:rFonts w:ascii="Cordia New" w:hAnsi="Cordia New" w:cs="Cordia New" w:hint="cs"/>
-          <w:sz w:val="18"/>
-          <w:szCs w:val="18"/>
-        </w:rPr>
-        <w:t>group_roles = [</w:t>
+      <w:proofErr w:type="spellStart"/>
+      <w:r>
+        <w:rPr>
+          <w:rFonts w:ascii="Cordia New" w:hAnsi="Cordia New" w:cs="Cordia New" w:hint="cs"/>
+          <w:sz w:val="18"/>
+          <w:szCs w:val="18"/>
+        </w:rPr>
+        <w:t>group_roles</w:t>
+      </w:r>
+      <w:proofErr w:type="spellEnd"/>
+      <w:r>
+        <w:rPr>
+          <w:rFonts w:ascii="Cordia New" w:hAnsi="Cordia New" w:cs="Cordia New" w:hint="cs"/>
+          <w:sz w:val="18"/>
+          <w:szCs w:val="18"/>
+        </w:rPr>
+        <w:t xml:space="preserve"> = [</w:t>
       </w:r>
       <w:r>
         <w:rPr>
@@ -14293,7 +15002,16 @@
           <w:szCs w:val="18"/>
         </w:rPr>
         <w:br/>
-        <w:t xml:space="preserve">    </w:t>
+        <w:t xml:space="preserve"> </w:t>
+      </w:r>
+      <w:proofErr w:type="gramStart"/>
+      <w:r>
+        <w:rPr>
+          <w:rFonts w:ascii="Cordia New" w:hAnsi="Cordia New" w:cs="Cordia New" w:hint="cs"/>
+          <w:sz w:val="18"/>
+          <w:szCs w:val="18"/>
+        </w:rPr>
+        <w:t xml:space="preserve">   </w:t>
       </w:r>
       <w:bookmarkStart w:id="114" w:name="OLE_LINK29"/>
       <w:bookmarkStart w:id="115" w:name="OLE_LINK30"/>
@@ -14303,7 +15021,16 @@
           <w:sz w:val="18"/>
           <w:szCs w:val="18"/>
         </w:rPr>
-        <w:t>("</w:t>
+        <w:t>(</w:t>
+      </w:r>
+      <w:proofErr w:type="gramEnd"/>
+      <w:r>
+        <w:rPr>
+          <w:rFonts w:ascii="Cordia New" w:hAnsi="Cordia New" w:cs="Cordia New" w:hint="cs"/>
+          <w:sz w:val="18"/>
+          <w:szCs w:val="18"/>
+        </w:rPr>
+        <w:t>"</w:t>
       </w:r>
       <w:r>
         <w:rPr>
@@ -14359,7 +15086,16 @@
           <w:szCs w:val="18"/>
         </w:rPr>
         <w:br/>
-        <w:t xml:space="preserve">    </w:t>
+        <w:t xml:space="preserve"> </w:t>
+      </w:r>
+      <w:proofErr w:type="gramStart"/>
+      <w:r>
+        <w:rPr>
+          <w:rFonts w:ascii="Cordia New" w:hAnsi="Cordia New" w:cs="Cordia New" w:hint="cs"/>
+          <w:sz w:val="18"/>
+          <w:szCs w:val="18"/>
+        </w:rPr>
+        <w:t xml:space="preserve">   </w:t>
       </w:r>
       <w:r>
         <w:rPr>
@@ -14368,7 +15104,17 @@
           <w:sz w:val="18"/>
           <w:szCs w:val="18"/>
         </w:rPr>
-        <w:t>("</w:t>
+        <w:t>(</w:t>
+      </w:r>
+      <w:proofErr w:type="gramEnd"/>
+      <w:r>
+        <w:rPr>
+          <w:rFonts w:ascii="Cordia New" w:hAnsi="Cordia New" w:cs="Cordia New" w:hint="cs"/>
+          <w:color w:val="D3D0C8"/>
+          <w:sz w:val="18"/>
+          <w:szCs w:val="18"/>
+        </w:rPr>
+        <w:t>"</w:t>
       </w:r>
       <w:r>
         <w:rPr>
@@ -14457,13 +15203,23 @@
           <w:szCs w:val="18"/>
         </w:rPr>
       </w:pPr>
-      <w:r>
-        <w:rPr>
-          <w:rFonts w:ascii="Cordia New" w:hAnsi="Cordia New" w:cs="Cordia New" w:hint="cs"/>
-          <w:sz w:val="18"/>
-          <w:szCs w:val="18"/>
-        </w:rPr>
-        <w:t>group_roles = [</w:t>
+      <w:proofErr w:type="spellStart"/>
+      <w:r>
+        <w:rPr>
+          <w:rFonts w:ascii="Cordia New" w:hAnsi="Cordia New" w:cs="Cordia New" w:hint="cs"/>
+          <w:sz w:val="18"/>
+          <w:szCs w:val="18"/>
+        </w:rPr>
+        <w:t>group_roles</w:t>
+      </w:r>
+      <w:proofErr w:type="spellEnd"/>
+      <w:r>
+        <w:rPr>
+          <w:rFonts w:ascii="Cordia New" w:hAnsi="Cordia New" w:cs="Cordia New" w:hint="cs"/>
+          <w:sz w:val="18"/>
+          <w:szCs w:val="18"/>
+        </w:rPr>
+        <w:t xml:space="preserve"> = [</w:t>
       </w:r>
       <w:r>
         <w:rPr>
@@ -14490,7 +15246,25 @@
           <w:szCs w:val="18"/>
         </w:rPr>
         <w:br/>
-        <w:t xml:space="preserve">    ("</w:t>
+        <w:t xml:space="preserve"> </w:t>
+      </w:r>
+      <w:proofErr w:type="gramStart"/>
+      <w:r>
+        <w:rPr>
+          <w:rFonts w:ascii="Cordia New" w:hAnsi="Cordia New" w:cs="Cordia New" w:hint="cs"/>
+          <w:sz w:val="18"/>
+          <w:szCs w:val="18"/>
+        </w:rPr>
+        <w:t xml:space="preserve">   (</w:t>
+      </w:r>
+      <w:proofErr w:type="gramEnd"/>
+      <w:r>
+        <w:rPr>
+          <w:rFonts w:ascii="Cordia New" w:hAnsi="Cordia New" w:cs="Cordia New" w:hint="cs"/>
+          <w:sz w:val="18"/>
+          <w:szCs w:val="18"/>
+        </w:rPr>
+        <w:t>"</w:t>
       </w:r>
       <w:r>
         <w:rPr>
@@ -14533,7 +15307,25 @@
           <w:szCs w:val="18"/>
         </w:rPr>
         <w:br/>
-        <w:t xml:space="preserve">    ("</w:t>
+        <w:t xml:space="preserve"> </w:t>
+      </w:r>
+      <w:proofErr w:type="gramStart"/>
+      <w:r>
+        <w:rPr>
+          <w:rFonts w:ascii="Cordia New" w:hAnsi="Cordia New" w:cs="Cordia New" w:hint="cs"/>
+          <w:sz w:val="18"/>
+          <w:szCs w:val="18"/>
+        </w:rPr>
+        <w:t xml:space="preserve">   (</w:t>
+      </w:r>
+      <w:proofErr w:type="gramEnd"/>
+      <w:r>
+        <w:rPr>
+          <w:rFonts w:ascii="Cordia New" w:hAnsi="Cordia New" w:cs="Cordia New" w:hint="cs"/>
+          <w:sz w:val="18"/>
+          <w:szCs w:val="18"/>
+        </w:rPr>
+        <w:t>"</w:t>
       </w:r>
       <w:r>
         <w:rPr>
@@ -14600,7 +15392,25 @@
           <w:sz w:val="18"/>
           <w:szCs w:val="18"/>
         </w:rPr>
-        <w:t xml:space="preserve">    ("</w:t>
+        <w:t xml:space="preserve"> </w:t>
+      </w:r>
+      <w:proofErr w:type="gramStart"/>
+      <w:r>
+        <w:rPr>
+          <w:rFonts w:ascii="Cordia New" w:hAnsi="Cordia New" w:cs="Cordia New" w:hint="cs"/>
+          <w:sz w:val="18"/>
+          <w:szCs w:val="18"/>
+        </w:rPr>
+        <w:t xml:space="preserve">   (</w:t>
+      </w:r>
+      <w:proofErr w:type="gramEnd"/>
+      <w:r>
+        <w:rPr>
+          <w:rFonts w:ascii="Cordia New" w:hAnsi="Cordia New" w:cs="Cordia New" w:hint="cs"/>
+          <w:sz w:val="18"/>
+          <w:szCs w:val="18"/>
+        </w:rPr>
+        <w:t>"</w:t>
       </w:r>
       <w:r>
         <w:rPr>
@@ -14665,7 +15475,7 @@
           <w:noProof/>
         </w:rPr>
         <w:drawing>
-          <wp:anchor distT="0" distB="0" distL="114300" distR="114300" simplePos="0" relativeHeight="251680768" behindDoc="1" locked="0" layoutInCell="1" allowOverlap="1" wp14:anchorId="289F10C5" wp14:editId="0BAF4D6F">
+          <wp:anchor distT="0" distB="0" distL="114300" distR="114300" simplePos="0" relativeHeight="251680768" behindDoc="1" locked="0" layoutInCell="1" allowOverlap="1" wp14:anchorId="289F10C5" wp14:editId="66EF9479">
             <wp:simplePos x="0" y="0"/>
             <wp:positionH relativeFrom="column">
               <wp:posOffset>3835400</wp:posOffset>
@@ -14879,13 +15689,23 @@
         </w:rPr>
         <w:t>/</w:t>
       </w:r>
+      <w:proofErr w:type="spellStart"/>
       <w:r>
         <w:rPr>
           <w:rFonts w:asciiTheme="minorHAnsi" w:hAnsiTheme="minorHAnsi" w:cstheme="minorHAnsi"/>
           <w:i/>
           <w:iCs/>
         </w:rPr>
-        <w:t>pcg/key-based</w:t>
+        <w:t>pcg</w:t>
+      </w:r>
+      <w:proofErr w:type="spellEnd"/>
+      <w:r>
+        <w:rPr>
+          <w:rFonts w:asciiTheme="minorHAnsi" w:hAnsiTheme="minorHAnsi" w:cstheme="minorHAnsi"/>
+          <w:i/>
+          <w:iCs/>
+        </w:rPr>
+        <w:t>/key-based</w:t>
       </w:r>
       <w:r>
         <w:rPr>
@@ -15165,7 +15985,47 @@
           <w:sz w:val="18"/>
           <w:szCs w:val="18"/>
         </w:rPr>
-        <w:t>"create_time"</w:t>
+        <w:t>"</w:t>
+      </w:r>
+      <w:proofErr w:type="spellStart"/>
+      <w:proofErr w:type="gramStart"/>
+      <w:r>
+        <w:rPr>
+          <w:rStyle w:val="hljs-attr"/>
+          <w:rFonts w:ascii="Cordia New" w:hAnsi="Cordia New" w:cs="Cordia New" w:hint="cs"/>
+          <w:b/>
+          <w:bCs/>
+          <w:color w:val="FFFFFF"/>
+          <w:sz w:val="18"/>
+          <w:szCs w:val="18"/>
+        </w:rPr>
+        <w:t>create</w:t>
+      </w:r>
+      <w:proofErr w:type="gramEnd"/>
+      <w:r>
+        <w:rPr>
+          <w:rStyle w:val="hljs-attr"/>
+          <w:rFonts w:ascii="Cordia New" w:hAnsi="Cordia New" w:cs="Cordia New" w:hint="cs"/>
+          <w:b/>
+          <w:bCs/>
+          <w:color w:val="FFFFFF"/>
+          <w:sz w:val="18"/>
+          <w:szCs w:val="18"/>
+        </w:rPr>
+        <w:t>_time</w:t>
+      </w:r>
+      <w:proofErr w:type="spellEnd"/>
+      <w:r>
+        <w:rPr>
+          <w:rStyle w:val="hljs-attr"/>
+          <w:rFonts w:ascii="Cordia New" w:hAnsi="Cordia New" w:cs="Cordia New" w:hint="cs"/>
+          <w:b/>
+          <w:bCs/>
+          <w:color w:val="FFFFFF"/>
+          <w:sz w:val="18"/>
+          <w:szCs w:val="18"/>
+        </w:rPr>
+        <w:t>"</w:t>
       </w:r>
       <w:r>
         <w:rPr>
@@ -15240,7 +16100,47 @@
           <w:sz w:val="18"/>
           <w:szCs w:val="18"/>
         </w:rPr>
-        <w:t>"update_time"</w:t>
+        <w:t>"</w:t>
+      </w:r>
+      <w:proofErr w:type="spellStart"/>
+      <w:proofErr w:type="gramStart"/>
+      <w:r>
+        <w:rPr>
+          <w:rStyle w:val="hljs-attr"/>
+          <w:rFonts w:ascii="Cordia New" w:hAnsi="Cordia New" w:cs="Cordia New" w:hint="cs"/>
+          <w:b/>
+          <w:bCs/>
+          <w:color w:val="FFFFFF"/>
+          <w:sz w:val="18"/>
+          <w:szCs w:val="18"/>
+        </w:rPr>
+        <w:t>update</w:t>
+      </w:r>
+      <w:proofErr w:type="gramEnd"/>
+      <w:r>
+        <w:rPr>
+          <w:rStyle w:val="hljs-attr"/>
+          <w:rFonts w:ascii="Cordia New" w:hAnsi="Cordia New" w:cs="Cordia New" w:hint="cs"/>
+          <w:b/>
+          <w:bCs/>
+          <w:color w:val="FFFFFF"/>
+          <w:sz w:val="18"/>
+          <w:szCs w:val="18"/>
+        </w:rPr>
+        <w:t>_time</w:t>
+      </w:r>
+      <w:proofErr w:type="spellEnd"/>
+      <w:r>
+        <w:rPr>
+          <w:rStyle w:val="hljs-attr"/>
+          <w:rFonts w:ascii="Cordia New" w:hAnsi="Cordia New" w:cs="Cordia New" w:hint="cs"/>
+          <w:b/>
+          <w:bCs/>
+          <w:color w:val="FFFFFF"/>
+          <w:sz w:val="18"/>
+          <w:szCs w:val="18"/>
+        </w:rPr>
+        <w:t>"</w:t>
       </w:r>
       <w:r>
         <w:rPr>
@@ -15315,7 +16215,47 @@
           <w:sz w:val="18"/>
           <w:szCs w:val="18"/>
         </w:rPr>
-        <w:t>"org_id"</w:t>
+        <w:t>"</w:t>
+      </w:r>
+      <w:proofErr w:type="spellStart"/>
+      <w:proofErr w:type="gramStart"/>
+      <w:r>
+        <w:rPr>
+          <w:rStyle w:val="hljs-attr"/>
+          <w:rFonts w:ascii="Cordia New" w:hAnsi="Cordia New" w:cs="Cordia New" w:hint="cs"/>
+          <w:b/>
+          <w:bCs/>
+          <w:color w:val="FFFFFF"/>
+          <w:sz w:val="18"/>
+          <w:szCs w:val="18"/>
+        </w:rPr>
+        <w:t>org</w:t>
+      </w:r>
+      <w:proofErr w:type="gramEnd"/>
+      <w:r>
+        <w:rPr>
+          <w:rStyle w:val="hljs-attr"/>
+          <w:rFonts w:ascii="Cordia New" w:hAnsi="Cordia New" w:cs="Cordia New" w:hint="cs"/>
+          <w:b/>
+          <w:bCs/>
+          <w:color w:val="FFFFFF"/>
+          <w:sz w:val="18"/>
+          <w:szCs w:val="18"/>
+        </w:rPr>
+        <w:t>_id</w:t>
+      </w:r>
+      <w:proofErr w:type="spellEnd"/>
+      <w:r>
+        <w:rPr>
+          <w:rStyle w:val="hljs-attr"/>
+          <w:rFonts w:ascii="Cordia New" w:hAnsi="Cordia New" w:cs="Cordia New" w:hint="cs"/>
+          <w:b/>
+          <w:bCs/>
+          <w:color w:val="FFFFFF"/>
+          <w:sz w:val="18"/>
+          <w:szCs w:val="18"/>
+        </w:rPr>
+        <w:t>"</w:t>
       </w:r>
       <w:r>
         <w:rPr>
@@ -15390,7 +16330,47 @@
           <w:sz w:val="18"/>
           <w:szCs w:val="18"/>
         </w:rPr>
-        <w:t>"policy_id"</w:t>
+        <w:t>"</w:t>
+      </w:r>
+      <w:proofErr w:type="spellStart"/>
+      <w:proofErr w:type="gramStart"/>
+      <w:r>
+        <w:rPr>
+          <w:rStyle w:val="hljs-attr"/>
+          <w:rFonts w:ascii="Cordia New" w:hAnsi="Cordia New" w:cs="Cordia New" w:hint="cs"/>
+          <w:b/>
+          <w:bCs/>
+          <w:color w:val="FFFFFF"/>
+          <w:sz w:val="18"/>
+          <w:szCs w:val="18"/>
+        </w:rPr>
+        <w:t>policy</w:t>
+      </w:r>
+      <w:proofErr w:type="gramEnd"/>
+      <w:r>
+        <w:rPr>
+          <w:rStyle w:val="hljs-attr"/>
+          <w:rFonts w:ascii="Cordia New" w:hAnsi="Cordia New" w:cs="Cordia New" w:hint="cs"/>
+          <w:b/>
+          <w:bCs/>
+          <w:color w:val="FFFFFF"/>
+          <w:sz w:val="18"/>
+          <w:szCs w:val="18"/>
+        </w:rPr>
+        <w:t>_id</w:t>
+      </w:r>
+      <w:proofErr w:type="spellEnd"/>
+      <w:r>
+        <w:rPr>
+          <w:rStyle w:val="hljs-attr"/>
+          <w:rFonts w:ascii="Cordia New" w:hAnsi="Cordia New" w:cs="Cordia New" w:hint="cs"/>
+          <w:b/>
+          <w:bCs/>
+          <w:color w:val="FFFFFF"/>
+          <w:sz w:val="18"/>
+          <w:szCs w:val="18"/>
+        </w:rPr>
+        <w:t>"</w:t>
       </w:r>
       <w:r>
         <w:rPr>
@@ -15465,7 +16445,47 @@
           <w:sz w:val="18"/>
           <w:szCs w:val="18"/>
         </w:rPr>
-        <w:t>"policy_name"</w:t>
+        <w:t>"</w:t>
+      </w:r>
+      <w:proofErr w:type="spellStart"/>
+      <w:proofErr w:type="gramStart"/>
+      <w:r>
+        <w:rPr>
+          <w:rStyle w:val="hljs-attr"/>
+          <w:rFonts w:ascii="Cordia New" w:hAnsi="Cordia New" w:cs="Cordia New" w:hint="cs"/>
+          <w:b/>
+          <w:bCs/>
+          <w:color w:val="FFFFFF"/>
+          <w:sz w:val="18"/>
+          <w:szCs w:val="18"/>
+        </w:rPr>
+        <w:t>policy</w:t>
+      </w:r>
+      <w:proofErr w:type="gramEnd"/>
+      <w:r>
+        <w:rPr>
+          <w:rStyle w:val="hljs-attr"/>
+          <w:rFonts w:ascii="Cordia New" w:hAnsi="Cordia New" w:cs="Cordia New" w:hint="cs"/>
+          <w:b/>
+          <w:bCs/>
+          <w:color w:val="FFFFFF"/>
+          <w:sz w:val="18"/>
+          <w:szCs w:val="18"/>
+        </w:rPr>
+        <w:t>_name</w:t>
+      </w:r>
+      <w:proofErr w:type="spellEnd"/>
+      <w:r>
+        <w:rPr>
+          <w:rStyle w:val="hljs-attr"/>
+          <w:rFonts w:ascii="Cordia New" w:hAnsi="Cordia New" w:cs="Cordia New" w:hint="cs"/>
+          <w:b/>
+          <w:bCs/>
+          <w:color w:val="FFFFFF"/>
+          <w:sz w:val="18"/>
+          <w:szCs w:val="18"/>
+        </w:rPr>
+        <w:t>"</w:t>
       </w:r>
       <w:r>
         <w:rPr>
@@ -15489,7 +16509,33 @@
           <w:sz w:val="18"/>
           <w:szCs w:val="18"/>
         </w:rPr>
-        <w:t>"JB_Lab"</w:t>
+        <w:t>"</w:t>
+      </w:r>
+      <w:proofErr w:type="spellStart"/>
+      <w:r>
+        <w:rPr>
+          <w:rStyle w:val="HTMLCode"/>
+          <w:rFonts w:ascii="Cordia New" w:hAnsi="Cordia New" w:cs="Cordia New" w:hint="cs"/>
+          <w:b/>
+          <w:bCs/>
+          <w:color w:val="A2FCA2"/>
+          <w:sz w:val="18"/>
+          <w:szCs w:val="18"/>
+        </w:rPr>
+        <w:t>JB_Lab</w:t>
+      </w:r>
+      <w:proofErr w:type="spellEnd"/>
+      <w:r>
+        <w:rPr>
+          <w:rStyle w:val="HTMLCode"/>
+          <w:rFonts w:ascii="Cordia New" w:hAnsi="Cordia New" w:cs="Cordia New" w:hint="cs"/>
+          <w:b/>
+          <w:bCs/>
+          <w:color w:val="A2FCA2"/>
+          <w:sz w:val="18"/>
+          <w:szCs w:val="18"/>
+        </w:rPr>
+        <w:t>"</w:t>
       </w:r>
       <w:r>
         <w:rPr>
@@ -15540,7 +16586,47 @@
           <w:sz w:val="18"/>
           <w:szCs w:val="18"/>
         </w:rPr>
-        <w:t>"ssid_name"</w:t>
+        <w:t>"</w:t>
+      </w:r>
+      <w:proofErr w:type="spellStart"/>
+      <w:proofErr w:type="gramStart"/>
+      <w:r>
+        <w:rPr>
+          <w:rStyle w:val="hljs-attr"/>
+          <w:rFonts w:ascii="Cordia New" w:hAnsi="Cordia New" w:cs="Cordia New" w:hint="cs"/>
+          <w:b/>
+          <w:bCs/>
+          <w:color w:val="FFFFFF"/>
+          <w:sz w:val="18"/>
+          <w:szCs w:val="18"/>
+        </w:rPr>
+        <w:t>ssid</w:t>
+      </w:r>
+      <w:proofErr w:type="gramEnd"/>
+      <w:r>
+        <w:rPr>
+          <w:rStyle w:val="hljs-attr"/>
+          <w:rFonts w:ascii="Cordia New" w:hAnsi="Cordia New" w:cs="Cordia New" w:hint="cs"/>
+          <w:b/>
+          <w:bCs/>
+          <w:color w:val="FFFFFF"/>
+          <w:sz w:val="18"/>
+          <w:szCs w:val="18"/>
+        </w:rPr>
+        <w:t>_name</w:t>
+      </w:r>
+      <w:proofErr w:type="spellEnd"/>
+      <w:r>
+        <w:rPr>
+          <w:rStyle w:val="hljs-attr"/>
+          <w:rFonts w:ascii="Cordia New" w:hAnsi="Cordia New" w:cs="Cordia New" w:hint="cs"/>
+          <w:b/>
+          <w:bCs/>
+          <w:color w:val="FFFFFF"/>
+          <w:sz w:val="18"/>
+          <w:szCs w:val="18"/>
+        </w:rPr>
+        <w:t>"</w:t>
       </w:r>
       <w:r>
         <w:rPr>
@@ -15564,7 +16650,33 @@
           <w:sz w:val="18"/>
           <w:szCs w:val="18"/>
         </w:rPr>
-        <w:t>"PCG_Test"</w:t>
+        <w:t>"</w:t>
+      </w:r>
+      <w:proofErr w:type="spellStart"/>
+      <w:r>
+        <w:rPr>
+          <w:rStyle w:val="HTMLCode"/>
+          <w:rFonts w:ascii="Cordia New" w:hAnsi="Cordia New" w:cs="Cordia New" w:hint="cs"/>
+          <w:b/>
+          <w:bCs/>
+          <w:color w:val="A2FCA2"/>
+          <w:sz w:val="18"/>
+          <w:szCs w:val="18"/>
+        </w:rPr>
+        <w:t>PCG_Test</w:t>
+      </w:r>
+      <w:proofErr w:type="spellEnd"/>
+      <w:r>
+        <w:rPr>
+          <w:rStyle w:val="HTMLCode"/>
+          <w:rFonts w:ascii="Cordia New" w:hAnsi="Cordia New" w:cs="Cordia New" w:hint="cs"/>
+          <w:b/>
+          <w:bCs/>
+          <w:color w:val="A2FCA2"/>
+          <w:sz w:val="18"/>
+          <w:szCs w:val="18"/>
+        </w:rPr>
+        <w:t>"</w:t>
       </w:r>
       <w:r>
         <w:rPr>
@@ -16006,13 +17118,23 @@
                                 <w:szCs w:val="16"/>
                               </w:rPr>
                             </w:pPr>
+                            <w:proofErr w:type="spellStart"/>
                             <w:r>
                               <w:rPr>
                                 <w:rFonts w:ascii="Cambria" w:hAnsi="Cambria"/>
                                 <w:sz w:val="16"/>
                                 <w:szCs w:val="16"/>
                               </w:rPr>
-                              <w:t>chmod +x</w:t>
+                              <w:t>chmod</w:t>
+                            </w:r>
+                            <w:proofErr w:type="spellEnd"/>
+                            <w:r>
+                              <w:rPr>
+                                <w:rFonts w:ascii="Cambria" w:hAnsi="Cambria"/>
+                                <w:sz w:val="16"/>
+                                <w:szCs w:val="16"/>
+                              </w:rPr>
+                              <w:t xml:space="preserve"> +x</w:t>
                             </w:r>
                             <w:r>
                               <w:rPr>
@@ -16069,13 +17191,23 @@
                           <w:szCs w:val="16"/>
                         </w:rPr>
                       </w:pPr>
+                      <w:proofErr w:type="spellStart"/>
                       <w:r>
                         <w:rPr>
                           <w:rFonts w:ascii="Cambria" w:hAnsi="Cambria"/>
                           <w:sz w:val="16"/>
                           <w:szCs w:val="16"/>
                         </w:rPr>
-                        <w:t>chmod +x</w:t>
+                        <w:t>chmod</w:t>
+                      </w:r>
+                      <w:proofErr w:type="spellEnd"/>
+                      <w:r>
+                        <w:rPr>
+                          <w:rFonts w:ascii="Cambria" w:hAnsi="Cambria"/>
+                          <w:sz w:val="16"/>
+                          <w:szCs w:val="16"/>
+                        </w:rPr>
+                        <w:t xml:space="preserve"> +x</w:t>
                       </w:r>
                       <w:r>
                         <w:rPr>
@@ -16187,6 +17319,7 @@
                                 <w:szCs w:val="16"/>
                               </w:rPr>
                             </w:pPr>
+                            <w:proofErr w:type="gramStart"/>
                             <w:r>
                               <w:rPr>
                                 <w:rFonts w:ascii="Cambria" w:hAnsi="Cambria"/>
@@ -16195,6 +17328,7 @@
                               </w:rPr>
                               <w:t>./</w:t>
                             </w:r>
+                            <w:proofErr w:type="gramEnd"/>
                             <w:r>
                               <w:rPr>
                                 <w:rFonts w:ascii="Apple Braille" w:hAnsi="Apple Braille"/>
@@ -16250,6 +17384,7 @@
                           <w:szCs w:val="16"/>
                         </w:rPr>
                       </w:pPr>
+                      <w:proofErr w:type="gramStart"/>
                       <w:r>
                         <w:rPr>
                           <w:rFonts w:ascii="Cambria" w:hAnsi="Cambria"/>
@@ -16258,6 +17393,7 @@
                         </w:rPr>
                         <w:t>./</w:t>
                       </w:r>
+                      <w:proofErr w:type="gramEnd"/>
                       <w:r>
                         <w:rPr>
                           <w:rFonts w:ascii="Apple Braille" w:hAnsi="Apple Braille"/>
@@ -16508,10 +17644,21 @@
           <w:sz w:val="18"/>
           <w:szCs w:val="18"/>
         </w:rPr>
-        <w:t xml:space="preserve"> email set and will not be created in xiq</w:t>
+        <w:t xml:space="preserve"> email set and will not be created in </w:t>
+      </w:r>
+      <w:proofErr w:type="spellStart"/>
+      <w:r>
+        <w:rPr>
+          <w:rFonts w:ascii="Cordia New" w:hAnsi="Cordia New" w:cs="Cordia New" w:hint="cs"/>
+          <w:color w:val="D3D0C8"/>
+          <w:sz w:val="18"/>
+          <w:szCs w:val="18"/>
+        </w:rPr>
+        <w:t>xiq</w:t>
       </w:r>
       <w:bookmarkEnd w:id="121"/>
       <w:bookmarkEnd w:id="122"/>
+      <w:proofErr w:type="spellEnd"/>
     </w:p>
     <w:p/>
     <w:p>
@@ -17005,7 +18152,21 @@
         <w:rPr>
           <w:rFonts w:asciiTheme="minorHAnsi" w:hAnsiTheme="minorHAnsi" w:cstheme="minorHAnsi"/>
         </w:rPr>
-        <w:t xml:space="preserve"> parts to a cron job configuration. </w:t>
+        <w:t xml:space="preserve"> parts to a </w:t>
+      </w:r>
+      <w:proofErr w:type="spellStart"/>
+      <w:r>
+        <w:rPr>
+          <w:rFonts w:asciiTheme="minorHAnsi" w:hAnsiTheme="minorHAnsi" w:cstheme="minorHAnsi"/>
+        </w:rPr>
+        <w:t>cron</w:t>
+      </w:r>
+      <w:proofErr w:type="spellEnd"/>
+      <w:r>
+        <w:rPr>
+          <w:rFonts w:asciiTheme="minorHAnsi" w:hAnsiTheme="minorHAnsi" w:cstheme="minorHAnsi"/>
+        </w:rPr>
+        <w:t xml:space="preserve"> job configuration. </w:t>
       </w:r>
     </w:p>
     <w:p>
@@ -17070,7 +18231,27 @@
           <w:sz w:val="20"/>
           <w:szCs w:val="20"/>
         </w:rPr>
-        <w:t>Part 1 of the cron job</w:t>
+        <w:t xml:space="preserve">Part 1 of the </w:t>
+      </w:r>
+      <w:proofErr w:type="spellStart"/>
+      <w:r>
+        <w:rPr>
+          <w:rFonts w:asciiTheme="majorHAnsi" w:hAnsiTheme="majorHAnsi" w:cstheme="majorHAnsi"/>
+          <w:color w:val="767171" w:themeColor="background2" w:themeShade="80"/>
+          <w:sz w:val="20"/>
+          <w:szCs w:val="20"/>
+        </w:rPr>
+        <w:t>cron</w:t>
+      </w:r>
+      <w:proofErr w:type="spellEnd"/>
+      <w:r>
+        <w:rPr>
+          <w:rFonts w:asciiTheme="majorHAnsi" w:hAnsiTheme="majorHAnsi" w:cstheme="majorHAnsi"/>
+          <w:color w:val="767171" w:themeColor="background2" w:themeShade="80"/>
+          <w:sz w:val="20"/>
+          <w:szCs w:val="20"/>
+        </w:rPr>
+        <w:t xml:space="preserve"> job</w:t>
       </w:r>
     </w:p>
     <w:p>
@@ -17625,7 +18806,27 @@
           <w:sz w:val="20"/>
           <w:szCs w:val="20"/>
         </w:rPr>
-        <w:t>Part 2 of the cron job</w:t>
+        <w:t xml:space="preserve">Part 2 of the </w:t>
+      </w:r>
+      <w:proofErr w:type="spellStart"/>
+      <w:r>
+        <w:rPr>
+          <w:rFonts w:asciiTheme="majorHAnsi" w:hAnsiTheme="majorHAnsi" w:cstheme="majorHAnsi"/>
+          <w:color w:val="767171" w:themeColor="background2" w:themeShade="80"/>
+          <w:sz w:val="20"/>
+          <w:szCs w:val="20"/>
+        </w:rPr>
+        <w:t>cron</w:t>
+      </w:r>
+      <w:proofErr w:type="spellEnd"/>
+      <w:r>
+        <w:rPr>
+          <w:rFonts w:asciiTheme="majorHAnsi" w:hAnsiTheme="majorHAnsi" w:cstheme="majorHAnsi"/>
+          <w:color w:val="767171" w:themeColor="background2" w:themeShade="80"/>
+          <w:sz w:val="20"/>
+          <w:szCs w:val="20"/>
+        </w:rPr>
+        <w:t xml:space="preserve"> job</w:t>
       </w:r>
     </w:p>
     <w:p>
@@ -17859,13 +19060,23 @@
                                 <w:szCs w:val="16"/>
                               </w:rPr>
                             </w:pPr>
+                            <w:proofErr w:type="spellStart"/>
                             <w:r>
                               <w:rPr>
                                 <w:rFonts w:ascii="Apple Braille" w:hAnsi="Apple Braille"/>
                                 <w:sz w:val="16"/>
                                 <w:szCs w:val="16"/>
                               </w:rPr>
-                              <w:t>chmod +x /home/admin/documents/scripts/XIQ-</w:t>
+                              <w:t>chmod</w:t>
+                            </w:r>
+                            <w:proofErr w:type="spellEnd"/>
+                            <w:r>
+                              <w:rPr>
+                                <w:rFonts w:ascii="Apple Braille" w:hAnsi="Apple Braille"/>
+                                <w:sz w:val="16"/>
+                                <w:szCs w:val="16"/>
+                              </w:rPr>
+                              <w:t xml:space="preserve"> +x /home/admin/documents/scripts/XIQ-</w:t>
                             </w:r>
                             <w:r>
                               <w:rPr>
@@ -17914,13 +19125,23 @@
                           <w:szCs w:val="16"/>
                         </w:rPr>
                       </w:pPr>
+                      <w:proofErr w:type="spellStart"/>
                       <w:r>
                         <w:rPr>
                           <w:rFonts w:ascii="Apple Braille" w:hAnsi="Apple Braille"/>
                           <w:sz w:val="16"/>
                           <w:szCs w:val="16"/>
                         </w:rPr>
-                        <w:t>chmod +x /home/admin/documents/scripts/XIQ-</w:t>
+                        <w:t>chmod</w:t>
+                      </w:r>
+                      <w:proofErr w:type="spellEnd"/>
+                      <w:r>
+                        <w:rPr>
+                          <w:rFonts w:ascii="Apple Braille" w:hAnsi="Apple Braille"/>
+                          <w:sz w:val="16"/>
+                          <w:szCs w:val="16"/>
+                        </w:rPr>
+                        <w:t xml:space="preserve"> +x /home/admin/documents/scripts/XIQ-</w:t>
                       </w:r>
                       <w:r>
                         <w:rPr>
@@ -18150,7 +19371,27 @@
           <w:sz w:val="20"/>
           <w:szCs w:val="20"/>
         </w:rPr>
-        <w:t>Optional Part 3 of the cron job</w:t>
+        <w:t xml:space="preserve">Optional Part 3 of the </w:t>
+      </w:r>
+      <w:proofErr w:type="spellStart"/>
+      <w:r>
+        <w:rPr>
+          <w:rFonts w:asciiTheme="majorHAnsi" w:hAnsiTheme="majorHAnsi" w:cstheme="majorHAnsi"/>
+          <w:color w:val="767171" w:themeColor="background2" w:themeShade="80"/>
+          <w:sz w:val="20"/>
+          <w:szCs w:val="20"/>
+        </w:rPr>
+        <w:t>cron</w:t>
+      </w:r>
+      <w:proofErr w:type="spellEnd"/>
+      <w:r>
+        <w:rPr>
+          <w:rFonts w:asciiTheme="majorHAnsi" w:hAnsiTheme="majorHAnsi" w:cstheme="majorHAnsi"/>
+          <w:color w:val="767171" w:themeColor="background2" w:themeShade="80"/>
+          <w:sz w:val="20"/>
+          <w:szCs w:val="20"/>
+        </w:rPr>
+        <w:t xml:space="preserve"> job</w:t>
       </w:r>
     </w:p>
     <w:p>
@@ -18175,7 +19416,21 @@
         <w:rPr>
           <w:rFonts w:asciiTheme="minorHAnsi" w:hAnsiTheme="minorHAnsi" w:cstheme="minorHAnsi"/>
         </w:rPr>
-        <w:t>, the cron will send an email to the owner of the crontab file.</w:t>
+        <w:t xml:space="preserve">, the </w:t>
+      </w:r>
+      <w:proofErr w:type="spellStart"/>
+      <w:r>
+        <w:rPr>
+          <w:rFonts w:asciiTheme="minorHAnsi" w:hAnsiTheme="minorHAnsi" w:cstheme="minorHAnsi"/>
+        </w:rPr>
+        <w:t>cron</w:t>
+      </w:r>
+      <w:proofErr w:type="spellEnd"/>
+      <w:r>
+        <w:rPr>
+          <w:rFonts w:asciiTheme="minorHAnsi" w:hAnsiTheme="minorHAnsi" w:cstheme="minorHAnsi"/>
+        </w:rPr>
+        <w:t xml:space="preserve"> will send an email to the owner of the crontab file.</w:t>
       </w:r>
     </w:p>
     <w:p>
@@ -18906,7 +20161,25 @@
                                 <w:sz w:val="15"/>
                                 <w:szCs w:val="15"/>
                               </w:rPr>
-                              <w:t>0 */12 * * * ./home/admin/documents/scripts/XIQ-</w:t>
+                              <w:t xml:space="preserve">0 */12 * * </w:t>
+                            </w:r>
+                            <w:proofErr w:type="gramStart"/>
+                            <w:r>
+                              <w:rPr>
+                                <w:rFonts w:ascii="Apple Braille" w:hAnsi="Apple Braille"/>
+                                <w:sz w:val="15"/>
+                                <w:szCs w:val="15"/>
+                              </w:rPr>
+                              <w:t>* .</w:t>
+                            </w:r>
+                            <w:proofErr w:type="gramEnd"/>
+                            <w:r>
+                              <w:rPr>
+                                <w:rFonts w:ascii="Apple Braille" w:hAnsi="Apple Braille"/>
+                                <w:sz w:val="15"/>
+                                <w:szCs w:val="15"/>
+                              </w:rPr>
+                              <w:t>/home/admin/documents/scripts/XIQ-</w:t>
                             </w:r>
                             <w:r>
                               <w:rPr>
@@ -19004,7 +20277,25 @@
                           <w:sz w:val="15"/>
                           <w:szCs w:val="15"/>
                         </w:rPr>
-                        <w:t>0 */12 * * * ./home/admin/documents/scripts/XIQ-</w:t>
+                        <w:t xml:space="preserve">0 */12 * * </w:t>
+                      </w:r>
+                      <w:proofErr w:type="gramStart"/>
+                      <w:r>
+                        <w:rPr>
+                          <w:rFonts w:ascii="Apple Braille" w:hAnsi="Apple Braille"/>
+                          <w:sz w:val="15"/>
+                          <w:szCs w:val="15"/>
+                        </w:rPr>
+                        <w:t>* .</w:t>
+                      </w:r>
+                      <w:proofErr w:type="gramEnd"/>
+                      <w:r>
+                        <w:rPr>
+                          <w:rFonts w:ascii="Apple Braille" w:hAnsi="Apple Braille"/>
+                          <w:sz w:val="15"/>
+                          <w:szCs w:val="15"/>
+                        </w:rPr>
+                        <w:t>/home/admin/documents/scripts/XIQ-</w:t>
                       </w:r>
                       <w:r>
                         <w:rPr>
@@ -19482,6 +20773,8 @@
                                 <w:szCs w:val="16"/>
                               </w:rPr>
                             </w:pPr>
+                            <w:proofErr w:type="spellStart"/>
+                            <w:proofErr w:type="gramStart"/>
                             <w:r>
                               <w:rPr>
                                 <w:rFonts w:ascii="Apple Braille" w:hAnsi="Apple Braille"/>
@@ -19490,6 +20783,8 @@
                               </w:rPr>
                               <w:t>sys.executable</w:t>
                             </w:r>
+                            <w:proofErr w:type="spellEnd"/>
+                            <w:proofErr w:type="gramEnd"/>
                           </w:p>
                         </w:txbxContent>
                       </wps:txbx>
@@ -19524,6 +20819,8 @@
                           <w:szCs w:val="16"/>
                         </w:rPr>
                       </w:pPr>
+                      <w:proofErr w:type="spellStart"/>
+                      <w:proofErr w:type="gramStart"/>
                       <w:r>
                         <w:rPr>
                           <w:rFonts w:ascii="Apple Braille" w:hAnsi="Apple Braille"/>
@@ -19532,6 +20829,8 @@
                         </w:rPr>
                         <w:t>sys.executable</w:t>
                       </w:r>
+                      <w:proofErr w:type="spellEnd"/>
+                      <w:proofErr w:type="gramEnd"/>
                     </w:p>
                   </w:txbxContent>
                 </v:textbox>
@@ -19838,13 +21137,23 @@
                                 <w:szCs w:val="16"/>
                               </w:rPr>
                             </w:pPr>
+                            <w:proofErr w:type="gramStart"/>
                             <w:r>
                               <w:rPr>
                                 <w:rFonts w:ascii="Apple Braille" w:hAnsi="Apple Braille"/>
                                 <w:sz w:val="16"/>
                                 <w:szCs w:val="16"/>
                               </w:rPr>
-                              <w:t xml:space="preserve">exit() </w:t>
+                              <w:t>exit(</w:t>
+                            </w:r>
+                            <w:proofErr w:type="gramEnd"/>
+                            <w:r>
+                              <w:rPr>
+                                <w:rFonts w:ascii="Apple Braille" w:hAnsi="Apple Braille"/>
+                                <w:sz w:val="16"/>
+                                <w:szCs w:val="16"/>
+                              </w:rPr>
+                              <w:t xml:space="preserve">) </w:t>
                             </w:r>
                           </w:p>
                         </w:txbxContent>
@@ -19877,13 +21186,23 @@
                           <w:szCs w:val="16"/>
                         </w:rPr>
                       </w:pPr>
+                      <w:proofErr w:type="gramStart"/>
                       <w:r>
                         <w:rPr>
                           <w:rFonts w:ascii="Apple Braille" w:hAnsi="Apple Braille"/>
                           <w:sz w:val="16"/>
                           <w:szCs w:val="16"/>
                         </w:rPr>
-                        <w:t xml:space="preserve">exit() </w:t>
+                        <w:t>exit(</w:t>
+                      </w:r>
+                      <w:proofErr w:type="gramEnd"/>
+                      <w:r>
+                        <w:rPr>
+                          <w:rFonts w:ascii="Apple Braille" w:hAnsi="Apple Braille"/>
+                          <w:sz w:val="16"/>
+                          <w:szCs w:val="16"/>
+                        </w:rPr>
+                        <w:t xml:space="preserve">) </w:t>
                       </w:r>
                     </w:p>
                   </w:txbxContent>
@@ -19936,7 +21255,7 @@
           <w:noProof/>
         </w:rPr>
         <w:drawing>
-          <wp:anchor distT="0" distB="0" distL="114300" distR="114300" simplePos="0" relativeHeight="251714560" behindDoc="0" locked="0" layoutInCell="1" allowOverlap="1" wp14:anchorId="5286A750" wp14:editId="16105591">
+          <wp:anchor distT="0" distB="0" distL="114300" distR="114300" simplePos="0" relativeHeight="251714560" behindDoc="0" locked="0" layoutInCell="1" allowOverlap="1" wp14:anchorId="5286A750" wp14:editId="56ADDC77">
             <wp:simplePos x="0" y="0"/>
             <wp:positionH relativeFrom="column">
               <wp:posOffset>4309110</wp:posOffset>
@@ -20716,7 +22035,27 @@
           <w:sz w:val="18"/>
           <w:szCs w:val="18"/>
         </w:rPr>
-        <w:t>'error_code'</w:t>
+        <w:t>'</w:t>
+      </w:r>
+      <w:proofErr w:type="spellStart"/>
+      <w:r>
+        <w:rPr>
+          <w:rFonts w:ascii="Cordia New" w:hAnsi="Cordia New" w:cs="Cordia New" w:hint="cs"/>
+          <w:color w:val="99CC99"/>
+          <w:sz w:val="18"/>
+          <w:szCs w:val="18"/>
+        </w:rPr>
+        <w:t>error_code</w:t>
+      </w:r>
+      <w:proofErr w:type="spellEnd"/>
+      <w:r>
+        <w:rPr>
+          <w:rFonts w:ascii="Cordia New" w:hAnsi="Cordia New" w:cs="Cordia New" w:hint="cs"/>
+          <w:color w:val="99CC99"/>
+          <w:sz w:val="18"/>
+          <w:szCs w:val="18"/>
+        </w:rPr>
+        <w:t>'</w:t>
       </w:r>
       <w:r>
         <w:rPr>
@@ -20734,7 +22073,27 @@
           <w:sz w:val="18"/>
           <w:szCs w:val="18"/>
         </w:rPr>
-        <w:t>'AuthInvalidToken'</w:t>
+        <w:t>'</w:t>
+      </w:r>
+      <w:proofErr w:type="spellStart"/>
+      <w:r>
+        <w:rPr>
+          <w:rFonts w:ascii="Cordia New" w:hAnsi="Cordia New" w:cs="Cordia New" w:hint="cs"/>
+          <w:color w:val="99CC99"/>
+          <w:sz w:val="18"/>
+          <w:szCs w:val="18"/>
+        </w:rPr>
+        <w:t>AuthInvalidToken</w:t>
+      </w:r>
+      <w:proofErr w:type="spellEnd"/>
+      <w:r>
+        <w:rPr>
+          <w:rFonts w:ascii="Cordia New" w:hAnsi="Cordia New" w:cs="Cordia New" w:hint="cs"/>
+          <w:color w:val="99CC99"/>
+          <w:sz w:val="18"/>
+          <w:szCs w:val="18"/>
+        </w:rPr>
+        <w:t>'</w:t>
       </w:r>
       <w:r>
         <w:rPr>
@@ -20752,7 +22111,27 @@
           <w:sz w:val="18"/>
           <w:szCs w:val="18"/>
         </w:rPr>
-        <w:t>'error_id'</w:t>
+        <w:t>'</w:t>
+      </w:r>
+      <w:proofErr w:type="spellStart"/>
+      <w:r>
+        <w:rPr>
+          <w:rFonts w:ascii="Cordia New" w:hAnsi="Cordia New" w:cs="Cordia New" w:hint="cs"/>
+          <w:color w:val="99CC99"/>
+          <w:sz w:val="18"/>
+          <w:szCs w:val="18"/>
+        </w:rPr>
+        <w:t>error_id</w:t>
+      </w:r>
+      <w:proofErr w:type="spellEnd"/>
+      <w:r>
+        <w:rPr>
+          <w:rFonts w:ascii="Cordia New" w:hAnsi="Cordia New" w:cs="Cordia New" w:hint="cs"/>
+          <w:color w:val="99CC99"/>
+          <w:sz w:val="18"/>
+          <w:szCs w:val="18"/>
+        </w:rPr>
+        <w:t>'</w:t>
       </w:r>
       <w:r>
         <w:rPr>
@@ -20788,7 +22167,27 @@
           <w:sz w:val="18"/>
           <w:szCs w:val="18"/>
         </w:rPr>
-        <w:t>'error_message'</w:t>
+        <w:t>'</w:t>
+      </w:r>
+      <w:proofErr w:type="spellStart"/>
+      <w:r>
+        <w:rPr>
+          <w:rFonts w:ascii="Cordia New" w:hAnsi="Cordia New" w:cs="Cordia New" w:hint="cs"/>
+          <w:color w:val="99CC99"/>
+          <w:sz w:val="18"/>
+          <w:szCs w:val="18"/>
+        </w:rPr>
+        <w:t>error_message</w:t>
+      </w:r>
+      <w:proofErr w:type="spellEnd"/>
+      <w:r>
+        <w:rPr>
+          <w:rFonts w:ascii="Cordia New" w:hAnsi="Cordia New" w:cs="Cordia New" w:hint="cs"/>
+          <w:color w:val="99CC99"/>
+          <w:sz w:val="18"/>
+          <w:szCs w:val="18"/>
+        </w:rPr>
+        <w:t>'</w:t>
       </w:r>
       <w:r>
         <w:rPr>
@@ -21109,8 +22508,19 @@
           <w:sz w:val="18"/>
           <w:szCs w:val="18"/>
         </w:rPr>
-        <w:t xml:space="preserve"> -       {</w:t>
-      </w:r>
+        <w:t xml:space="preserve"> -    </w:t>
+      </w:r>
+      <w:proofErr w:type="gramStart"/>
+      <w:r>
+        <w:rPr>
+          <w:rFonts w:ascii="Cordia New" w:hAnsi="Cordia New" w:cs="Cordia New" w:hint="cs"/>
+          <w:color w:val="D3D0C8"/>
+          <w:sz w:val="18"/>
+          <w:szCs w:val="18"/>
+        </w:rPr>
+        <w:t xml:space="preserve">   {</w:t>
+      </w:r>
+      <w:proofErr w:type="gramEnd"/>
       <w:r>
         <w:rPr>
           <w:rFonts w:ascii="Cordia New" w:hAnsi="Cordia New" w:cs="Cordia New" w:hint="cs"/>
@@ -21118,7 +22528,27 @@
           <w:sz w:val="18"/>
           <w:szCs w:val="18"/>
         </w:rPr>
-        <w:t>'error_code'</w:t>
+        <w:t>'</w:t>
+      </w:r>
+      <w:proofErr w:type="spellStart"/>
+      <w:r>
+        <w:rPr>
+          <w:rFonts w:ascii="Cordia New" w:hAnsi="Cordia New" w:cs="Cordia New" w:hint="cs"/>
+          <w:color w:val="99CC99"/>
+          <w:sz w:val="18"/>
+          <w:szCs w:val="18"/>
+        </w:rPr>
+        <w:t>error_code</w:t>
+      </w:r>
+      <w:proofErr w:type="spellEnd"/>
+      <w:r>
+        <w:rPr>
+          <w:rFonts w:ascii="Cordia New" w:hAnsi="Cordia New" w:cs="Cordia New" w:hint="cs"/>
+          <w:color w:val="99CC99"/>
+          <w:sz w:val="18"/>
+          <w:szCs w:val="18"/>
+        </w:rPr>
+        <w:t>'</w:t>
       </w:r>
       <w:r>
         <w:rPr>
@@ -21136,7 +22566,27 @@
           <w:sz w:val="18"/>
           <w:szCs w:val="18"/>
         </w:rPr>
-        <w:t>'AuthInvalidToken'</w:t>
+        <w:t>'</w:t>
+      </w:r>
+      <w:proofErr w:type="spellStart"/>
+      <w:r>
+        <w:rPr>
+          <w:rFonts w:ascii="Cordia New" w:hAnsi="Cordia New" w:cs="Cordia New" w:hint="cs"/>
+          <w:color w:val="99CC99"/>
+          <w:sz w:val="18"/>
+          <w:szCs w:val="18"/>
+        </w:rPr>
+        <w:t>AuthInvalidToken</w:t>
+      </w:r>
+      <w:proofErr w:type="spellEnd"/>
+      <w:r>
+        <w:rPr>
+          <w:rFonts w:ascii="Cordia New" w:hAnsi="Cordia New" w:cs="Cordia New" w:hint="cs"/>
+          <w:color w:val="99CC99"/>
+          <w:sz w:val="18"/>
+          <w:szCs w:val="18"/>
+        </w:rPr>
+        <w:t>'</w:t>
       </w:r>
       <w:r>
         <w:rPr>
@@ -21154,7 +22604,27 @@
           <w:sz w:val="18"/>
           <w:szCs w:val="18"/>
         </w:rPr>
-        <w:t>'error_id'</w:t>
+        <w:t>'</w:t>
+      </w:r>
+      <w:proofErr w:type="spellStart"/>
+      <w:r>
+        <w:rPr>
+          <w:rFonts w:ascii="Cordia New" w:hAnsi="Cordia New" w:cs="Cordia New" w:hint="cs"/>
+          <w:color w:val="99CC99"/>
+          <w:sz w:val="18"/>
+          <w:szCs w:val="18"/>
+        </w:rPr>
+        <w:t>error_id</w:t>
+      </w:r>
+      <w:proofErr w:type="spellEnd"/>
+      <w:r>
+        <w:rPr>
+          <w:rFonts w:ascii="Cordia New" w:hAnsi="Cordia New" w:cs="Cordia New" w:hint="cs"/>
+          <w:color w:val="99CC99"/>
+          <w:sz w:val="18"/>
+          <w:szCs w:val="18"/>
+        </w:rPr>
+        <w:t>'</w:t>
       </w:r>
       <w:r>
         <w:rPr>
@@ -21190,7 +22660,27 @@
           <w:sz w:val="18"/>
           <w:szCs w:val="18"/>
         </w:rPr>
-        <w:t>'error_message'</w:t>
+        <w:t>'</w:t>
+      </w:r>
+      <w:proofErr w:type="spellStart"/>
+      <w:r>
+        <w:rPr>
+          <w:rFonts w:ascii="Cordia New" w:hAnsi="Cordia New" w:cs="Cordia New" w:hint="cs"/>
+          <w:color w:val="99CC99"/>
+          <w:sz w:val="18"/>
+          <w:szCs w:val="18"/>
+        </w:rPr>
+        <w:t>error_message</w:t>
+      </w:r>
+      <w:proofErr w:type="spellEnd"/>
+      <w:r>
+        <w:rPr>
+          <w:rFonts w:ascii="Cordia New" w:hAnsi="Cordia New" w:cs="Cordia New" w:hint="cs"/>
+          <w:color w:val="99CC99"/>
+          <w:sz w:val="18"/>
+          <w:szCs w:val="18"/>
+        </w:rPr>
+        <w:t>'</w:t>
       </w:r>
       <w:r>
         <w:rPr>
@@ -21523,7 +23013,27 @@
           <w:sz w:val="18"/>
           <w:szCs w:val="18"/>
         </w:rPr>
-        <w:t>'error_code'</w:t>
+        <w:t>'</w:t>
+      </w:r>
+      <w:proofErr w:type="spellStart"/>
+      <w:r>
+        <w:rPr>
+          <w:rFonts w:ascii="Cordia New" w:hAnsi="Cordia New" w:cs="Cordia New" w:hint="cs"/>
+          <w:color w:val="99CC99"/>
+          <w:sz w:val="18"/>
+          <w:szCs w:val="18"/>
+        </w:rPr>
+        <w:t>error_code</w:t>
+      </w:r>
+      <w:proofErr w:type="spellEnd"/>
+      <w:r>
+        <w:rPr>
+          <w:rFonts w:ascii="Cordia New" w:hAnsi="Cordia New" w:cs="Cordia New" w:hint="cs"/>
+          <w:color w:val="99CC99"/>
+          <w:sz w:val="18"/>
+          <w:szCs w:val="18"/>
+        </w:rPr>
+        <w:t>'</w:t>
       </w:r>
       <w:r>
         <w:rPr>
@@ -21541,7 +23051,27 @@
           <w:sz w:val="18"/>
           <w:szCs w:val="18"/>
         </w:rPr>
-        <w:t>'AuthTokenExpired'</w:t>
+        <w:t>'</w:t>
+      </w:r>
+      <w:proofErr w:type="spellStart"/>
+      <w:r>
+        <w:rPr>
+          <w:rFonts w:ascii="Cordia New" w:hAnsi="Cordia New" w:cs="Cordia New" w:hint="cs"/>
+          <w:color w:val="99CC99"/>
+          <w:sz w:val="18"/>
+          <w:szCs w:val="18"/>
+        </w:rPr>
+        <w:t>AuthTokenExpired</w:t>
+      </w:r>
+      <w:proofErr w:type="spellEnd"/>
+      <w:r>
+        <w:rPr>
+          <w:rFonts w:ascii="Cordia New" w:hAnsi="Cordia New" w:cs="Cordia New" w:hint="cs"/>
+          <w:color w:val="99CC99"/>
+          <w:sz w:val="18"/>
+          <w:szCs w:val="18"/>
+        </w:rPr>
+        <w:t>'</w:t>
       </w:r>
       <w:r>
         <w:rPr>
@@ -21559,7 +23089,27 @@
           <w:sz w:val="18"/>
           <w:szCs w:val="18"/>
         </w:rPr>
-        <w:t>'error_id'</w:t>
+        <w:t>'</w:t>
+      </w:r>
+      <w:proofErr w:type="spellStart"/>
+      <w:r>
+        <w:rPr>
+          <w:rFonts w:ascii="Cordia New" w:hAnsi="Cordia New" w:cs="Cordia New" w:hint="cs"/>
+          <w:color w:val="99CC99"/>
+          <w:sz w:val="18"/>
+          <w:szCs w:val="18"/>
+        </w:rPr>
+        <w:t>error_id</w:t>
+      </w:r>
+      <w:proofErr w:type="spellEnd"/>
+      <w:r>
+        <w:rPr>
+          <w:rFonts w:ascii="Cordia New" w:hAnsi="Cordia New" w:cs="Cordia New" w:hint="cs"/>
+          <w:color w:val="99CC99"/>
+          <w:sz w:val="18"/>
+          <w:szCs w:val="18"/>
+        </w:rPr>
+        <w:t>'</w:t>
       </w:r>
       <w:r>
         <w:rPr>
@@ -21595,7 +23145,27 @@
           <w:sz w:val="18"/>
           <w:szCs w:val="18"/>
         </w:rPr>
-        <w:t>'error_message'</w:t>
+        <w:t>'</w:t>
+      </w:r>
+      <w:proofErr w:type="spellStart"/>
+      <w:r>
+        <w:rPr>
+          <w:rFonts w:ascii="Cordia New" w:hAnsi="Cordia New" w:cs="Cordia New" w:hint="cs"/>
+          <w:color w:val="99CC99"/>
+          <w:sz w:val="18"/>
+          <w:szCs w:val="18"/>
+        </w:rPr>
+        <w:t>error_message</w:t>
+      </w:r>
+      <w:proofErr w:type="spellEnd"/>
+      <w:r>
+        <w:rPr>
+          <w:rFonts w:ascii="Cordia New" w:hAnsi="Cordia New" w:cs="Cordia New" w:hint="cs"/>
+          <w:color w:val="99CC99"/>
+          <w:sz w:val="18"/>
+          <w:szCs w:val="18"/>
+        </w:rPr>
+        <w:t>'</w:t>
       </w:r>
       <w:r>
         <w:rPr>
@@ -22228,7 +23798,17 @@
           <w:sz w:val="18"/>
           <w:szCs w:val="18"/>
         </w:rPr>
-        <w:t>"error"</w:t>
+        <w:t>"error</w:t>
+      </w:r>
+      <w:proofErr w:type="gramStart"/>
+      <w:r>
+        <w:rPr>
+          <w:rFonts w:ascii="Cordia New" w:hAnsi="Cordia New" w:cs="Cordia New" w:hint="cs"/>
+          <w:color w:val="99CC99"/>
+          <w:sz w:val="18"/>
+          <w:szCs w:val="18"/>
+        </w:rPr>
+        <w:t>"</w:t>
       </w:r>
       <w:r>
         <w:rPr>
@@ -22239,6 +23819,7 @@
         </w:rPr>
         <w:t>:{</w:t>
       </w:r>
+      <w:proofErr w:type="gramEnd"/>
       <w:r>
         <w:rPr>
           <w:rFonts w:ascii="Cordia New" w:hAnsi="Cordia New" w:cs="Cordia New" w:hint="cs"/>
@@ -22264,7 +23845,27 @@
           <w:sz w:val="18"/>
           <w:szCs w:val="18"/>
         </w:rPr>
-        <w:t>"Request_BadRequest"</w:t>
+        <w:t>"Request_</w:t>
+      </w:r>
+      <w:proofErr w:type="spellStart"/>
+      <w:r>
+        <w:rPr>
+          <w:rFonts w:ascii="Cordia New" w:hAnsi="Cordia New" w:cs="Cordia New" w:hint="cs"/>
+          <w:color w:val="99CC99"/>
+          <w:sz w:val="18"/>
+          <w:szCs w:val="18"/>
+        </w:rPr>
+        <w:t>BadRequest</w:t>
+      </w:r>
+      <w:proofErr w:type="spellEnd"/>
+      <w:r>
+        <w:rPr>
+          <w:rFonts w:ascii="Cordia New" w:hAnsi="Cordia New" w:cs="Cordia New" w:hint="cs"/>
+          <w:color w:val="99CC99"/>
+          <w:sz w:val="18"/>
+          <w:szCs w:val="18"/>
+        </w:rPr>
+        <w:t>"</w:t>
       </w:r>
       <w:r>
         <w:rPr>
@@ -22282,7 +23883,17 @@
           <w:sz w:val="18"/>
           <w:szCs w:val="18"/>
         </w:rPr>
-        <w:t>"message"</w:t>
+        <w:t>"</w:t>
+      </w:r>
+      <w:proofErr w:type="spellStart"/>
+      <w:r>
+        <w:rPr>
+          <w:rFonts w:ascii="Cordia New" w:hAnsi="Cordia New" w:cs="Cordia New" w:hint="cs"/>
+          <w:color w:val="99CC99"/>
+          <w:sz w:val="18"/>
+          <w:szCs w:val="18"/>
+        </w:rPr>
+        <w:t>message"</w:t>
       </w:r>
       <w:r>
         <w:rPr>
@@ -22300,7 +23911,17 @@
           <w:sz w:val="18"/>
           <w:szCs w:val="18"/>
         </w:rPr>
-        <w:t>"Invalid object identifier 'e7274e17-d57f-4cb3-b3e5-fe7231f952e'."</w:t>
+        <w:t>"Invalid</w:t>
+      </w:r>
+      <w:proofErr w:type="spellEnd"/>
+      <w:r>
+        <w:rPr>
+          <w:rFonts w:ascii="Cordia New" w:hAnsi="Cordia New" w:cs="Cordia New" w:hint="cs"/>
+          <w:color w:val="99CC99"/>
+          <w:sz w:val="18"/>
+          <w:szCs w:val="18"/>
+        </w:rPr>
+        <w:t xml:space="preserve"> object identifier 'e7274e17-d57f-4cb3-b3e5-fe7231f952e'."</w:t>
       </w:r>
       <w:r>
         <w:rPr>
@@ -22318,7 +23939,17 @@
           <w:sz w:val="18"/>
           <w:szCs w:val="18"/>
         </w:rPr>
-        <w:t>"innerError"</w:t>
+        <w:t>"innerError</w:t>
+      </w:r>
+      <w:proofErr w:type="gramStart"/>
+      <w:r>
+        <w:rPr>
+          <w:rFonts w:ascii="Cordia New" w:hAnsi="Cordia New" w:cs="Cordia New" w:hint="cs"/>
+          <w:color w:val="99CC99"/>
+          <w:sz w:val="18"/>
+          <w:szCs w:val="18"/>
+        </w:rPr>
+        <w:t>"</w:t>
       </w:r>
       <w:r>
         <w:rPr>
@@ -22329,6 +23960,7 @@
         </w:rPr>
         <w:t>:{</w:t>
       </w:r>
+      <w:proofErr w:type="gramEnd"/>
       <w:r>
         <w:rPr>
           <w:rFonts w:ascii="Cordia New" w:hAnsi="Cordia New" w:cs="Cordia New" w:hint="cs"/>
@@ -22829,8 +24461,19 @@
           <w:sz w:val="18"/>
           <w:szCs w:val="18"/>
         </w:rPr>
-        <w:t xml:space="preserve"> -       {</w:t>
-      </w:r>
+        <w:t xml:space="preserve"> -    </w:t>
+      </w:r>
+      <w:proofErr w:type="gramStart"/>
+      <w:r>
+        <w:rPr>
+          <w:rFonts w:ascii="Cordia New" w:hAnsi="Cordia New" w:cs="Cordia New" w:hint="cs"/>
+          <w:color w:val="D3D0C8"/>
+          <w:sz w:val="18"/>
+          <w:szCs w:val="18"/>
+        </w:rPr>
+        <w:t xml:space="preserve">   {</w:t>
+      </w:r>
+      <w:proofErr w:type="gramEnd"/>
       <w:r>
         <w:rPr>
           <w:rFonts w:ascii="Cordia New" w:hAnsi="Cordia New" w:cs="Cordia New" w:hint="cs"/>
@@ -22838,7 +24481,27 @@
           <w:sz w:val="18"/>
           <w:szCs w:val="18"/>
         </w:rPr>
-        <w:t>'error_code'</w:t>
+        <w:t>'</w:t>
+      </w:r>
+      <w:proofErr w:type="spellStart"/>
+      <w:r>
+        <w:rPr>
+          <w:rFonts w:ascii="Cordia New" w:hAnsi="Cordia New" w:cs="Cordia New" w:hint="cs"/>
+          <w:color w:val="99CC99"/>
+          <w:sz w:val="18"/>
+          <w:szCs w:val="18"/>
+        </w:rPr>
+        <w:t>error_code</w:t>
+      </w:r>
+      <w:proofErr w:type="spellEnd"/>
+      <w:r>
+        <w:rPr>
+          <w:rFonts w:ascii="Cordia New" w:hAnsi="Cordia New" w:cs="Cordia New" w:hint="cs"/>
+          <w:color w:val="99CC99"/>
+          <w:sz w:val="18"/>
+          <w:szCs w:val="18"/>
+        </w:rPr>
+        <w:t>'</w:t>
       </w:r>
       <w:r>
         <w:rPr>
@@ -22874,7 +24537,27 @@
           <w:sz w:val="18"/>
           <w:szCs w:val="18"/>
         </w:rPr>
-        <w:t>'error_id'</w:t>
+        <w:t>'</w:t>
+      </w:r>
+      <w:proofErr w:type="spellStart"/>
+      <w:r>
+        <w:rPr>
+          <w:rFonts w:ascii="Cordia New" w:hAnsi="Cordia New" w:cs="Cordia New" w:hint="cs"/>
+          <w:color w:val="99CC99"/>
+          <w:sz w:val="18"/>
+          <w:szCs w:val="18"/>
+        </w:rPr>
+        <w:t>error_id</w:t>
+      </w:r>
+      <w:proofErr w:type="spellEnd"/>
+      <w:r>
+        <w:rPr>
+          <w:rFonts w:ascii="Cordia New" w:hAnsi="Cordia New" w:cs="Cordia New" w:hint="cs"/>
+          <w:color w:val="99CC99"/>
+          <w:sz w:val="18"/>
+          <w:szCs w:val="18"/>
+        </w:rPr>
+        <w:t>'</w:t>
       </w:r>
       <w:r>
         <w:rPr>
@@ -22892,7 +24575,27 @@
           <w:sz w:val="18"/>
           <w:szCs w:val="18"/>
         </w:rPr>
-        <w:t>'error_message'</w:t>
+        <w:t>'</w:t>
+      </w:r>
+      <w:proofErr w:type="spellStart"/>
+      <w:r>
+        <w:rPr>
+          <w:rFonts w:ascii="Cordia New" w:hAnsi="Cordia New" w:cs="Cordia New" w:hint="cs"/>
+          <w:color w:val="99CC99"/>
+          <w:sz w:val="18"/>
+          <w:szCs w:val="18"/>
+        </w:rPr>
+        <w:t>error_message</w:t>
+      </w:r>
+      <w:proofErr w:type="spellEnd"/>
+      <w:r>
+        <w:rPr>
+          <w:rFonts w:ascii="Cordia New" w:hAnsi="Cordia New" w:cs="Cordia New" w:hint="cs"/>
+          <w:color w:val="99CC99"/>
+          <w:sz w:val="18"/>
+          <w:szCs w:val="18"/>
+        </w:rPr>
+        <w:t>'</w:t>
       </w:r>
       <w:r>
         <w:rPr>
@@ -23127,7 +24830,21 @@
         <w:rPr>
           <w:rFonts w:asciiTheme="minorHAnsi" w:hAnsiTheme="minorHAnsi" w:cstheme="minorHAnsi"/>
         </w:rPr>
-        <w:t xml:space="preserve"> check the user group ID in the group_roles list on </w:t>
+        <w:t xml:space="preserve"> check the user group ID in the </w:t>
+      </w:r>
+      <w:proofErr w:type="spellStart"/>
+      <w:r>
+        <w:rPr>
+          <w:rFonts w:asciiTheme="minorHAnsi" w:hAnsiTheme="minorHAnsi" w:cstheme="minorHAnsi"/>
+        </w:rPr>
+        <w:t>group_roles</w:t>
+      </w:r>
+      <w:proofErr w:type="spellEnd"/>
+      <w:r>
+        <w:rPr>
+          <w:rFonts w:asciiTheme="minorHAnsi" w:hAnsiTheme="minorHAnsi" w:cstheme="minorHAnsi"/>
+        </w:rPr>
+        <w:t xml:space="preserve"> list on </w:t>
       </w:r>
       <w:r>
         <w:rPr>
@@ -23599,8 +25316,19 @@
           <w:sz w:val="18"/>
           <w:szCs w:val="18"/>
         </w:rPr>
-        <w:t xml:space="preserve"> Smith doesn't have an email set and will not be created in xiq</w:t>
-      </w:r>
+        <w:t xml:space="preserve"> Smith doesn't have an email set and will not be created in </w:t>
+      </w:r>
+      <w:proofErr w:type="spellStart"/>
+      <w:r>
+        <w:rPr>
+          <w:rFonts w:ascii="Cordia New" w:hAnsi="Cordia New" w:cs="Cordia New" w:hint="cs"/>
+          <w:color w:val="D3D0C8"/>
+          <w:sz w:val="18"/>
+          <w:szCs w:val="18"/>
+        </w:rPr>
+        <w:t>xiq</w:t>
+      </w:r>
+      <w:proofErr w:type="spellEnd"/>
     </w:p>
     <w:p>
       <w:pPr>
@@ -23699,6 +25427,7 @@
         </w:rPr>
         <w:t xml:space="preserve"> should be added to the </w:t>
       </w:r>
+      <w:proofErr w:type="spellStart"/>
       <w:r>
         <w:rPr>
           <w:rFonts w:asciiTheme="minorHAnsi" w:hAnsiTheme="minorHAnsi" w:cstheme="minorHAnsi"/>
@@ -23707,6 +25436,7 @@
         </w:rPr>
         <w:t>ad_group_id</w:t>
       </w:r>
+      <w:proofErr w:type="spellEnd"/>
       <w:r>
         <w:rPr>
           <w:rFonts w:asciiTheme="minorHAnsi" w:hAnsiTheme="minorHAnsi" w:cstheme="minorHAnsi"/>
@@ -23719,7 +25449,21 @@
         <w:rPr>
           <w:rFonts w:asciiTheme="minorHAnsi" w:hAnsiTheme="minorHAnsi" w:cstheme="minorHAnsi"/>
         </w:rPr>
-        <w:t>variable instead of in the group_roles list.</w:t>
+        <w:t xml:space="preserve">variable instead of in the </w:t>
+      </w:r>
+      <w:proofErr w:type="spellStart"/>
+      <w:r>
+        <w:rPr>
+          <w:rFonts w:asciiTheme="minorHAnsi" w:hAnsiTheme="minorHAnsi" w:cstheme="minorHAnsi"/>
+        </w:rPr>
+        <w:t>group_roles</w:t>
+      </w:r>
+      <w:proofErr w:type="spellEnd"/>
+      <w:r>
+        <w:rPr>
+          <w:rFonts w:asciiTheme="minorHAnsi" w:hAnsiTheme="minorHAnsi" w:cstheme="minorHAnsi"/>
+        </w:rPr>
+        <w:t xml:space="preserve"> list.</w:t>
       </w:r>
     </w:p>
     <w:p>
@@ -23895,7 +25639,27 @@
           <w:sz w:val="18"/>
           <w:szCs w:val="18"/>
         </w:rPr>
-        <w:t xml:space="preserve">Tripp Smith {'accountEnabled': True, 'email': </w:t>
+        <w:t>Tripp Smith {'</w:t>
+      </w:r>
+      <w:proofErr w:type="spellStart"/>
+      <w:r>
+        <w:rPr>
+          <w:rFonts w:ascii="Cordia New" w:hAnsi="Cordia New" w:cs="Cordia New" w:hint="cs"/>
+          <w:color w:val="D3D0C8"/>
+          <w:sz w:val="18"/>
+          <w:szCs w:val="18"/>
+        </w:rPr>
+        <w:t>accountEnabled</w:t>
+      </w:r>
+      <w:proofErr w:type="spellEnd"/>
+      <w:r>
+        <w:rPr>
+          <w:rFonts w:ascii="Cordia New" w:hAnsi="Cordia New" w:cs="Cordia New" w:hint="cs"/>
+          <w:color w:val="D3D0C8"/>
+          <w:sz w:val="18"/>
+          <w:szCs w:val="18"/>
+        </w:rPr>
+        <w:t xml:space="preserve">': True, 'email': </w:t>
       </w:r>
       <w:bookmarkStart w:id="172" w:name="OLE_LINK35"/>
       <w:bookmarkStart w:id="173" w:name="OLE_LINK36"/>
@@ -23955,7 +25719,27 @@
           <w:sz w:val="18"/>
           <w:szCs w:val="18"/>
         </w:rPr>
-        <w:t xml:space="preserve">Miles Smith {'accountEnabled': True, 'email': </w:t>
+        <w:t>Miles Smith {'</w:t>
+      </w:r>
+      <w:proofErr w:type="spellStart"/>
+      <w:r>
+        <w:rPr>
+          <w:rFonts w:ascii="Cordia New" w:hAnsi="Cordia New" w:cs="Cordia New" w:hint="cs"/>
+          <w:color w:val="D3D0C8"/>
+          <w:sz w:val="18"/>
+          <w:szCs w:val="18"/>
+        </w:rPr>
+        <w:t>accountEnabled</w:t>
+      </w:r>
+      <w:proofErr w:type="spellEnd"/>
+      <w:r>
+        <w:rPr>
+          <w:rFonts w:ascii="Cordia New" w:hAnsi="Cordia New" w:cs="Cordia New" w:hint="cs"/>
+          <w:color w:val="D3D0C8"/>
+          <w:sz w:val="18"/>
+          <w:szCs w:val="18"/>
+        </w:rPr>
+        <w:t xml:space="preserve">': True, 'email': </w:t>
       </w:r>
       <w:r>
         <w:rPr>
@@ -24029,7 +25813,27 @@
           <w:sz w:val="18"/>
           <w:szCs w:val="18"/>
         </w:rPr>
-        <w:t xml:space="preserve">Bauer Smith {'accountEnabled': </w:t>
+        <w:t>Bauer Smith {'</w:t>
+      </w:r>
+      <w:proofErr w:type="spellStart"/>
+      <w:r>
+        <w:rPr>
+          <w:rFonts w:ascii="Cordia New" w:hAnsi="Cordia New" w:cs="Cordia New" w:hint="cs"/>
+          <w:color w:val="D3D0C8"/>
+          <w:sz w:val="18"/>
+          <w:szCs w:val="18"/>
+        </w:rPr>
+        <w:t>accountEnabled</w:t>
+      </w:r>
+      <w:proofErr w:type="spellEnd"/>
+      <w:r>
+        <w:rPr>
+          <w:rFonts w:ascii="Cordia New" w:hAnsi="Cordia New" w:cs="Cordia New" w:hint="cs"/>
+          <w:color w:val="D3D0C8"/>
+          <w:sz w:val="18"/>
+          <w:szCs w:val="18"/>
+        </w:rPr>
+        <w:t xml:space="preserve">': </w:t>
       </w:r>
       <w:proofErr w:type="gramStart"/>
       <w:r>
@@ -24142,7 +25946,27 @@
           <w:sz w:val="18"/>
           <w:szCs w:val="18"/>
         </w:rPr>
-        <w:t xml:space="preserve">Adele Smith {'accountEnabled': True, 'email': </w:t>
+        <w:t>Adele Smith {'</w:t>
+      </w:r>
+      <w:proofErr w:type="spellStart"/>
+      <w:r>
+        <w:rPr>
+          <w:rFonts w:ascii="Cordia New" w:hAnsi="Cordia New" w:cs="Cordia New" w:hint="cs"/>
+          <w:color w:val="D3D0C8"/>
+          <w:sz w:val="18"/>
+          <w:szCs w:val="18"/>
+        </w:rPr>
+        <w:t>accountEnabled</w:t>
+      </w:r>
+      <w:proofErr w:type="spellEnd"/>
+      <w:r>
+        <w:rPr>
+          <w:rFonts w:ascii="Cordia New" w:hAnsi="Cordia New" w:cs="Cordia New" w:hint="cs"/>
+          <w:color w:val="D3D0C8"/>
+          <w:sz w:val="18"/>
+          <w:szCs w:val="18"/>
+        </w:rPr>
+        <w:t xml:space="preserve">': True, 'email': </w:t>
       </w:r>
       <w:r>
         <w:rPr>
@@ -24225,7 +26049,27 @@
           <w:sz w:val="18"/>
           <w:szCs w:val="18"/>
         </w:rPr>
-        <w:t xml:space="preserve">Ruby Smith {'accountEnabled': True, 'email': </w:t>
+        <w:t>Ruby Smith {'</w:t>
+      </w:r>
+      <w:proofErr w:type="spellStart"/>
+      <w:r>
+        <w:rPr>
+          <w:rFonts w:ascii="Cordia New" w:hAnsi="Cordia New" w:cs="Cordia New" w:hint="cs"/>
+          <w:color w:val="D3D0C8"/>
+          <w:sz w:val="18"/>
+          <w:szCs w:val="18"/>
+        </w:rPr>
+        <w:t>accountEnabled</w:t>
+      </w:r>
+      <w:proofErr w:type="spellEnd"/>
+      <w:r>
+        <w:rPr>
+          <w:rFonts w:ascii="Cordia New" w:hAnsi="Cordia New" w:cs="Cordia New" w:hint="cs"/>
+          <w:color w:val="D3D0C8"/>
+          <w:sz w:val="18"/>
+          <w:szCs w:val="18"/>
+        </w:rPr>
+        <w:t xml:space="preserve">': True, 'email': </w:t>
       </w:r>
       <w:r>
         <w:rPr>
@@ -24287,7 +26131,7 @@
 </file>
 
 <file path=word/endnotes.xml><?xml version="1.0" encoding="utf-8"?>
-<w:endnotes xmlns:wpc="http://schemas.microsoft.com/office/word/2010/wordprocessingCanvas" xmlns:cx="http://schemas.microsoft.com/office/drawing/2014/chartex" xmlns:cx1="http://schemas.microsoft.com/office/drawing/2015/9/8/chartex" xmlns:cx2="http://schemas.microsoft.com/office/drawing/2015/10/21/chartex" xmlns:cx3="http://schemas.microsoft.com/office/drawing/2016/5/9/chartex" xmlns:cx4="http://schemas.microsoft.com/office/drawing/2016/5/10/chartex" xmlns:cx5="http://schemas.microsoft.com/office/drawing/2016/5/11/chartex" xmlns:cx6="http://schemas.microsoft.com/office/drawing/2016/5/12/chartex" xmlns:cx7="http://schemas.microsoft.com/office/drawing/2016/5/13/chartex" xmlns:cx8="http://schemas.microsoft.com/office/drawing/2016/5/14/chartex" xmlns:mc="http://schemas.openxmlformats.org/markup-compatibility/2006" xmlns:aink="http://schemas.microsoft.com/office/drawing/2016/ink" xmlns:am3d="http://schemas.microsoft.com/office/drawing/2017/model3d" xmlns:o="urn:schemas-microsoft-com:office:office" xmlns:oel="http://schemas.microsoft.com/office/2019/extlst" xmlns:r="http://schemas.openxmlformats.org/officeDocument/2006/relationships" xmlns:m="http://schemas.openxmlformats.org/officeDocument/2006/math" xmlns:v="urn:schemas-microsoft-com:vml" xmlns:wp14="http://schemas.microsoft.com/office/word/2010/wordprocessingDrawing" xmlns:wp="http://schemas.openxmlformats.org/drawingml/2006/wordprocessingDrawing" xmlns:w10="urn:schemas-microsoft-com:office:word" xmlns:w="http://schemas.openxmlformats.org/wordprocessingml/2006/main" xmlns:w14="http://schemas.microsoft.com/office/word/2010/wordml" xmlns:w15="http://schemas.microsoft.com/office/word/2012/wordml" xmlns:w16cex="http://schemas.microsoft.com/office/word/2018/wordml/cex" xmlns:w16cid="http://schemas.microsoft.com/office/word/2016/wordml/cid" xmlns:w16="http://schemas.microsoft.com/office/word/2018/wordml" xmlns:w16du="http://schemas.microsoft.com/office/word/2023/wordml/word16du" xmlns:w16sdtdh="http://schemas.microsoft.com/office/word/2020/wordml/sdtdatahash" xmlns:w16sdtfl="http://schemas.microsoft.com/office/word/2024/wordml/sdtformatlock" xmlns:w16se="http://schemas.microsoft.com/office/word/2015/wordml/symex" xmlns:wpg="http://schemas.microsoft.com/office/word/2010/wordprocessingGroup" xmlns:wpi="http://schemas.microsoft.com/office/word/2010/wordprocessingInk" xmlns:wne="http://schemas.microsoft.com/office/word/2006/wordml" xmlns:wps="http://schemas.microsoft.com/office/word/2010/wordprocessingShape" mc:Ignorable="w14 w15 w16se w16cid w16 w16cex w16sdtdh w16sdtfl w16du wp14">
+<w:endnotes xmlns:wpc="http://schemas.microsoft.com/office/word/2010/wordprocessingCanvas" xmlns:cx="http://schemas.microsoft.com/office/drawing/2014/chartex" xmlns:cx1="http://schemas.microsoft.com/office/drawing/2015/9/8/chartex" xmlns:cx2="http://schemas.microsoft.com/office/drawing/2015/10/21/chartex" xmlns:cx3="http://schemas.microsoft.com/office/drawing/2016/5/9/chartex" xmlns:cx4="http://schemas.microsoft.com/office/drawing/2016/5/10/chartex" xmlns:cx5="http://schemas.microsoft.com/office/drawing/2016/5/11/chartex" xmlns:cx6="http://schemas.microsoft.com/office/drawing/2016/5/12/chartex" xmlns:cx7="http://schemas.microsoft.com/office/drawing/2016/5/13/chartex" xmlns:cx8="http://schemas.microsoft.com/office/drawing/2016/5/14/chartex" xmlns:mc="http://schemas.openxmlformats.org/markup-compatibility/2006" xmlns:m="http://schemas.openxmlformats.org/officeDocument/2006/math" xmlns:aink="http://schemas.microsoft.com/office/drawing/2016/ink" xmlns:am3d="http://schemas.microsoft.com/office/drawing/2017/model3d" xmlns:oel="http://schemas.microsoft.com/office/2019/extlst" xmlns:r="http://schemas.openxmlformats.org/officeDocument/2006/relationships" xmlns:wp14="http://schemas.microsoft.com/office/word/2010/wordprocessingDrawing" xmlns:wp="http://schemas.openxmlformats.org/drawingml/2006/wordprocessingDrawing" xmlns:wpg="http://schemas.microsoft.com/office/word/2010/wordprocessingGroup" xmlns:wpi="http://schemas.microsoft.com/office/word/2010/wordprocessingInk" xmlns:wps="http://schemas.microsoft.com/office/word/2010/wordprocessingShape" xmlns:o="urn:schemas-microsoft-com:office:office" xmlns:v="urn:schemas-microsoft-com:vml" xmlns:w10="urn:schemas-microsoft-com:office:word" xmlns:w="http://schemas.openxmlformats.org/wordprocessingml/2006/main" xmlns:w14="http://schemas.microsoft.com/office/word/2010/wordml" xmlns:w15="http://schemas.microsoft.com/office/word/2012/wordml" xmlns:w16cex="http://schemas.microsoft.com/office/word/2018/wordml/cex" xmlns:w16cid="http://schemas.microsoft.com/office/word/2016/wordml/cid" xmlns:w16="http://schemas.microsoft.com/office/word/2018/wordml" xmlns:w16sdtdh="http://schemas.microsoft.com/office/word/2020/wordml/sdtdatahash" xmlns:w16sdtfl="http://schemas.microsoft.com/office/word/2024/wordml/sdtformatlock" xmlns:w16se="http://schemas.microsoft.com/office/word/2015/wordml/symex" xmlns:w16du="http://schemas.microsoft.com/office/word/2023/wordml/word16du" xmlns:wne="http://schemas.microsoft.com/office/word/2006/wordml" mc:Ignorable="w14 w15 w16se w16cid w16 w16cex w16sdtdh w16sdtfl w16du wp14">
   <w:endnote w:type="separator" w:id="-1">
     <w:p>
       <w:r>
@@ -24306,7 +26150,7 @@
 </file>
 
 <file path=word/footer1.xml><?xml version="1.0" encoding="utf-8"?>
-<w:ftr xmlns:wpc="http://schemas.microsoft.com/office/word/2010/wordprocessingCanvas" xmlns:cx="http://schemas.microsoft.com/office/drawing/2014/chartex" xmlns:cx1="http://schemas.microsoft.com/office/drawing/2015/9/8/chartex" xmlns:cx2="http://schemas.microsoft.com/office/drawing/2015/10/21/chartex" xmlns:cx3="http://schemas.microsoft.com/office/drawing/2016/5/9/chartex" xmlns:cx4="http://schemas.microsoft.com/office/drawing/2016/5/10/chartex" xmlns:cx5="http://schemas.microsoft.com/office/drawing/2016/5/11/chartex" xmlns:cx6="http://schemas.microsoft.com/office/drawing/2016/5/12/chartex" xmlns:cx7="http://schemas.microsoft.com/office/drawing/2016/5/13/chartex" xmlns:cx8="http://schemas.microsoft.com/office/drawing/2016/5/14/chartex" xmlns:mc="http://schemas.openxmlformats.org/markup-compatibility/2006" xmlns:aink="http://schemas.microsoft.com/office/drawing/2016/ink" xmlns:am3d="http://schemas.microsoft.com/office/drawing/2017/model3d" xmlns:o="urn:schemas-microsoft-com:office:office" xmlns:oel="http://schemas.microsoft.com/office/2019/extlst" xmlns:r="http://schemas.openxmlformats.org/officeDocument/2006/relationships" xmlns:m="http://schemas.openxmlformats.org/officeDocument/2006/math" xmlns:v="urn:schemas-microsoft-com:vml" xmlns:wp14="http://schemas.microsoft.com/office/word/2010/wordprocessingDrawing" xmlns:wp="http://schemas.openxmlformats.org/drawingml/2006/wordprocessingDrawing" xmlns:w10="urn:schemas-microsoft-com:office:word" xmlns:w="http://schemas.openxmlformats.org/wordprocessingml/2006/main" xmlns:w14="http://schemas.microsoft.com/office/word/2010/wordml" xmlns:w15="http://schemas.microsoft.com/office/word/2012/wordml" xmlns:w16cex="http://schemas.microsoft.com/office/word/2018/wordml/cex" xmlns:w16cid="http://schemas.microsoft.com/office/word/2016/wordml/cid" xmlns:w16="http://schemas.microsoft.com/office/word/2018/wordml" xmlns:w16du="http://schemas.microsoft.com/office/word/2023/wordml/word16du" xmlns:w16sdtdh="http://schemas.microsoft.com/office/word/2020/wordml/sdtdatahash" xmlns:w16sdtfl="http://schemas.microsoft.com/office/word/2024/wordml/sdtformatlock" xmlns:w16se="http://schemas.microsoft.com/office/word/2015/wordml/symex" xmlns:wpg="http://schemas.microsoft.com/office/word/2010/wordprocessingGroup" xmlns:wpi="http://schemas.microsoft.com/office/word/2010/wordprocessingInk" xmlns:wne="http://schemas.microsoft.com/office/word/2006/wordml" xmlns:wps="http://schemas.microsoft.com/office/word/2010/wordprocessingShape" mc:Ignorable="w14 w15 w16se w16cid w16 w16cex w16sdtdh w16sdtfl w16du wp14">
+<w:ftr xmlns:wpc="http://schemas.microsoft.com/office/word/2010/wordprocessingCanvas" xmlns:cx="http://schemas.microsoft.com/office/drawing/2014/chartex" xmlns:cx1="http://schemas.microsoft.com/office/drawing/2015/9/8/chartex" xmlns:cx2="http://schemas.microsoft.com/office/drawing/2015/10/21/chartex" xmlns:cx3="http://schemas.microsoft.com/office/drawing/2016/5/9/chartex" xmlns:cx4="http://schemas.microsoft.com/office/drawing/2016/5/10/chartex" xmlns:cx5="http://schemas.microsoft.com/office/drawing/2016/5/11/chartex" xmlns:cx6="http://schemas.microsoft.com/office/drawing/2016/5/12/chartex" xmlns:cx7="http://schemas.microsoft.com/office/drawing/2016/5/13/chartex" xmlns:cx8="http://schemas.microsoft.com/office/drawing/2016/5/14/chartex" xmlns:mc="http://schemas.openxmlformats.org/markup-compatibility/2006" xmlns:m="http://schemas.openxmlformats.org/officeDocument/2006/math" xmlns:aink="http://schemas.microsoft.com/office/drawing/2016/ink" xmlns:am3d="http://schemas.microsoft.com/office/drawing/2017/model3d" xmlns:oel="http://schemas.microsoft.com/office/2019/extlst" xmlns:r="http://schemas.openxmlformats.org/officeDocument/2006/relationships" xmlns:wp14="http://schemas.microsoft.com/office/word/2010/wordprocessingDrawing" xmlns:wp="http://schemas.openxmlformats.org/drawingml/2006/wordprocessingDrawing" xmlns:wpg="http://schemas.microsoft.com/office/word/2010/wordprocessingGroup" xmlns:wpi="http://schemas.microsoft.com/office/word/2010/wordprocessingInk" xmlns:wps="http://schemas.microsoft.com/office/word/2010/wordprocessingShape" xmlns:o="urn:schemas-microsoft-com:office:office" xmlns:v="urn:schemas-microsoft-com:vml" xmlns:w10="urn:schemas-microsoft-com:office:word" xmlns:w="http://schemas.openxmlformats.org/wordprocessingml/2006/main" xmlns:w14="http://schemas.microsoft.com/office/word/2010/wordml" xmlns:w15="http://schemas.microsoft.com/office/word/2012/wordml" xmlns:w16cex="http://schemas.microsoft.com/office/word/2018/wordml/cex" xmlns:w16cid="http://schemas.microsoft.com/office/word/2016/wordml/cid" xmlns:w16="http://schemas.microsoft.com/office/word/2018/wordml" xmlns:w16sdtdh="http://schemas.microsoft.com/office/word/2020/wordml/sdtdatahash" xmlns:w16sdtfl="http://schemas.microsoft.com/office/word/2024/wordml/sdtformatlock" xmlns:w16se="http://schemas.microsoft.com/office/word/2015/wordml/symex" xmlns:w16du="http://schemas.microsoft.com/office/word/2023/wordml/word16du" xmlns:wne="http://schemas.microsoft.com/office/word/2006/wordml" mc:Ignorable="w14 w15 w16se w16cid w16 w16cex w16sdtdh w16sdtfl w16du wp14">
   <w:p>
     <w:pPr>
       <w:pStyle w:val="Footer"/>
@@ -24412,7 +26256,7 @@
 </file>
 
 <file path=word/footnotes.xml><?xml version="1.0" encoding="utf-8"?>
-<w:footnotes xmlns:wpc="http://schemas.microsoft.com/office/word/2010/wordprocessingCanvas" xmlns:cx="http://schemas.microsoft.com/office/drawing/2014/chartex" xmlns:cx1="http://schemas.microsoft.com/office/drawing/2015/9/8/chartex" xmlns:cx2="http://schemas.microsoft.com/office/drawing/2015/10/21/chartex" xmlns:cx3="http://schemas.microsoft.com/office/drawing/2016/5/9/chartex" xmlns:cx4="http://schemas.microsoft.com/office/drawing/2016/5/10/chartex" xmlns:cx5="http://schemas.microsoft.com/office/drawing/2016/5/11/chartex" xmlns:cx6="http://schemas.microsoft.com/office/drawing/2016/5/12/chartex" xmlns:cx7="http://schemas.microsoft.com/office/drawing/2016/5/13/chartex" xmlns:cx8="http://schemas.microsoft.com/office/drawing/2016/5/14/chartex" xmlns:mc="http://schemas.openxmlformats.org/markup-compatibility/2006" xmlns:aink="http://schemas.microsoft.com/office/drawing/2016/ink" xmlns:am3d="http://schemas.microsoft.com/office/drawing/2017/model3d" xmlns:o="urn:schemas-microsoft-com:office:office" xmlns:oel="http://schemas.microsoft.com/office/2019/extlst" xmlns:r="http://schemas.openxmlformats.org/officeDocument/2006/relationships" xmlns:m="http://schemas.openxmlformats.org/officeDocument/2006/math" xmlns:v="urn:schemas-microsoft-com:vml" xmlns:wp14="http://schemas.microsoft.com/office/word/2010/wordprocessingDrawing" xmlns:wp="http://schemas.openxmlformats.org/drawingml/2006/wordprocessingDrawing" xmlns:w10="urn:schemas-microsoft-com:office:word" xmlns:w="http://schemas.openxmlformats.org/wordprocessingml/2006/main" xmlns:w14="http://schemas.microsoft.com/office/word/2010/wordml" xmlns:w15="http://schemas.microsoft.com/office/word/2012/wordml" xmlns:w16cex="http://schemas.microsoft.com/office/word/2018/wordml/cex" xmlns:w16cid="http://schemas.microsoft.com/office/word/2016/wordml/cid" xmlns:w16="http://schemas.microsoft.com/office/word/2018/wordml" xmlns:w16du="http://schemas.microsoft.com/office/word/2023/wordml/word16du" xmlns:w16sdtdh="http://schemas.microsoft.com/office/word/2020/wordml/sdtdatahash" xmlns:w16sdtfl="http://schemas.microsoft.com/office/word/2024/wordml/sdtformatlock" xmlns:w16se="http://schemas.microsoft.com/office/word/2015/wordml/symex" xmlns:wpg="http://schemas.microsoft.com/office/word/2010/wordprocessingGroup" xmlns:wpi="http://schemas.microsoft.com/office/word/2010/wordprocessingInk" xmlns:wne="http://schemas.microsoft.com/office/word/2006/wordml" xmlns:wps="http://schemas.microsoft.com/office/word/2010/wordprocessingShape" mc:Ignorable="w14 w15 w16se w16cid w16 w16cex w16sdtdh w16sdtfl w16du wp14">
+<w:footnotes xmlns:wpc="http://schemas.microsoft.com/office/word/2010/wordprocessingCanvas" xmlns:cx="http://schemas.microsoft.com/office/drawing/2014/chartex" xmlns:cx1="http://schemas.microsoft.com/office/drawing/2015/9/8/chartex" xmlns:cx2="http://schemas.microsoft.com/office/drawing/2015/10/21/chartex" xmlns:cx3="http://schemas.microsoft.com/office/drawing/2016/5/9/chartex" xmlns:cx4="http://schemas.microsoft.com/office/drawing/2016/5/10/chartex" xmlns:cx5="http://schemas.microsoft.com/office/drawing/2016/5/11/chartex" xmlns:cx6="http://schemas.microsoft.com/office/drawing/2016/5/12/chartex" xmlns:cx7="http://schemas.microsoft.com/office/drawing/2016/5/13/chartex" xmlns:cx8="http://schemas.microsoft.com/office/drawing/2016/5/14/chartex" xmlns:mc="http://schemas.openxmlformats.org/markup-compatibility/2006" xmlns:m="http://schemas.openxmlformats.org/officeDocument/2006/math" xmlns:aink="http://schemas.microsoft.com/office/drawing/2016/ink" xmlns:am3d="http://schemas.microsoft.com/office/drawing/2017/model3d" xmlns:oel="http://schemas.microsoft.com/office/2019/extlst" xmlns:r="http://schemas.openxmlformats.org/officeDocument/2006/relationships" xmlns:wp14="http://schemas.microsoft.com/office/word/2010/wordprocessingDrawing" xmlns:wp="http://schemas.openxmlformats.org/drawingml/2006/wordprocessingDrawing" xmlns:wpg="http://schemas.microsoft.com/office/word/2010/wordprocessingGroup" xmlns:wpi="http://schemas.microsoft.com/office/word/2010/wordprocessingInk" xmlns:wps="http://schemas.microsoft.com/office/word/2010/wordprocessingShape" xmlns:o="urn:schemas-microsoft-com:office:office" xmlns:v="urn:schemas-microsoft-com:vml" xmlns:w10="urn:schemas-microsoft-com:office:word" xmlns:w="http://schemas.openxmlformats.org/wordprocessingml/2006/main" xmlns:w14="http://schemas.microsoft.com/office/word/2010/wordml" xmlns:w15="http://schemas.microsoft.com/office/word/2012/wordml" xmlns:w16cex="http://schemas.microsoft.com/office/word/2018/wordml/cex" xmlns:w16cid="http://schemas.microsoft.com/office/word/2016/wordml/cid" xmlns:w16="http://schemas.microsoft.com/office/word/2018/wordml" xmlns:w16sdtdh="http://schemas.microsoft.com/office/word/2020/wordml/sdtdatahash" xmlns:w16sdtfl="http://schemas.microsoft.com/office/word/2024/wordml/sdtformatlock" xmlns:w16se="http://schemas.microsoft.com/office/word/2015/wordml/symex" xmlns:w16du="http://schemas.microsoft.com/office/word/2023/wordml/word16du" xmlns:wne="http://schemas.microsoft.com/office/word/2006/wordml" mc:Ignorable="w14 w15 w16se w16cid w16 w16cex w16sdtdh w16sdtfl w16du wp14">
   <w:footnote w:type="separator" w:id="-1">
     <w:p>
       <w:r>
@@ -24431,7 +26275,7 @@
 </file>
 
 <file path=word/header1.xml><?xml version="1.0" encoding="utf-8"?>
-<w:hdr xmlns:wpc="http://schemas.microsoft.com/office/word/2010/wordprocessingCanvas" xmlns:cx="http://schemas.microsoft.com/office/drawing/2014/chartex" xmlns:cx1="http://schemas.microsoft.com/office/drawing/2015/9/8/chartex" xmlns:cx2="http://schemas.microsoft.com/office/drawing/2015/10/21/chartex" xmlns:cx3="http://schemas.microsoft.com/office/drawing/2016/5/9/chartex" xmlns:cx4="http://schemas.microsoft.com/office/drawing/2016/5/10/chartex" xmlns:cx5="http://schemas.microsoft.com/office/drawing/2016/5/11/chartex" xmlns:cx6="http://schemas.microsoft.com/office/drawing/2016/5/12/chartex" xmlns:cx7="http://schemas.microsoft.com/office/drawing/2016/5/13/chartex" xmlns:cx8="http://schemas.microsoft.com/office/drawing/2016/5/14/chartex" xmlns:mc="http://schemas.openxmlformats.org/markup-compatibility/2006" xmlns:aink="http://schemas.microsoft.com/office/drawing/2016/ink" xmlns:am3d="http://schemas.microsoft.com/office/drawing/2017/model3d" xmlns:o="urn:schemas-microsoft-com:office:office" xmlns:oel="http://schemas.microsoft.com/office/2019/extlst" xmlns:r="http://schemas.openxmlformats.org/officeDocument/2006/relationships" xmlns:m="http://schemas.openxmlformats.org/officeDocument/2006/math" xmlns:v="urn:schemas-microsoft-com:vml" xmlns:wp14="http://schemas.microsoft.com/office/word/2010/wordprocessingDrawing" xmlns:wp="http://schemas.openxmlformats.org/drawingml/2006/wordprocessingDrawing" xmlns:w10="urn:schemas-microsoft-com:office:word" xmlns:w="http://schemas.openxmlformats.org/wordprocessingml/2006/main" xmlns:w14="http://schemas.microsoft.com/office/word/2010/wordml" xmlns:w15="http://schemas.microsoft.com/office/word/2012/wordml" xmlns:w16cex="http://schemas.microsoft.com/office/word/2018/wordml/cex" xmlns:w16cid="http://schemas.microsoft.com/office/word/2016/wordml/cid" xmlns:w16="http://schemas.microsoft.com/office/word/2018/wordml" xmlns:w16du="http://schemas.microsoft.com/office/word/2023/wordml/word16du" xmlns:w16sdtdh="http://schemas.microsoft.com/office/word/2020/wordml/sdtdatahash" xmlns:w16sdtfl="http://schemas.microsoft.com/office/word/2024/wordml/sdtformatlock" xmlns:w16se="http://schemas.microsoft.com/office/word/2015/wordml/symex" xmlns:wpg="http://schemas.microsoft.com/office/word/2010/wordprocessingGroup" xmlns:wpi="http://schemas.microsoft.com/office/word/2010/wordprocessingInk" xmlns:wne="http://schemas.microsoft.com/office/word/2006/wordml" xmlns:wps="http://schemas.microsoft.com/office/word/2010/wordprocessingShape" mc:Ignorable="w14 w15 w16se w16cid w16 w16cex w16sdtdh w16sdtfl w16du wp14">
+<w:hdr xmlns:wpc="http://schemas.microsoft.com/office/word/2010/wordprocessingCanvas" xmlns:cx="http://schemas.microsoft.com/office/drawing/2014/chartex" xmlns:cx1="http://schemas.microsoft.com/office/drawing/2015/9/8/chartex" xmlns:cx2="http://schemas.microsoft.com/office/drawing/2015/10/21/chartex" xmlns:cx3="http://schemas.microsoft.com/office/drawing/2016/5/9/chartex" xmlns:cx4="http://schemas.microsoft.com/office/drawing/2016/5/10/chartex" xmlns:cx5="http://schemas.microsoft.com/office/drawing/2016/5/11/chartex" xmlns:cx6="http://schemas.microsoft.com/office/drawing/2016/5/12/chartex" xmlns:cx7="http://schemas.microsoft.com/office/drawing/2016/5/13/chartex" xmlns:cx8="http://schemas.microsoft.com/office/drawing/2016/5/14/chartex" xmlns:mc="http://schemas.openxmlformats.org/markup-compatibility/2006" xmlns:m="http://schemas.openxmlformats.org/officeDocument/2006/math" xmlns:aink="http://schemas.microsoft.com/office/drawing/2016/ink" xmlns:am3d="http://schemas.microsoft.com/office/drawing/2017/model3d" xmlns:oel="http://schemas.microsoft.com/office/2019/extlst" xmlns:r="http://schemas.openxmlformats.org/officeDocument/2006/relationships" xmlns:wp14="http://schemas.microsoft.com/office/word/2010/wordprocessingDrawing" xmlns:wp="http://schemas.openxmlformats.org/drawingml/2006/wordprocessingDrawing" xmlns:wpg="http://schemas.microsoft.com/office/word/2010/wordprocessingGroup" xmlns:wpi="http://schemas.microsoft.com/office/word/2010/wordprocessingInk" xmlns:wps="http://schemas.microsoft.com/office/word/2010/wordprocessingShape" xmlns:o="urn:schemas-microsoft-com:office:office" xmlns:v="urn:schemas-microsoft-com:vml" xmlns:w10="urn:schemas-microsoft-com:office:word" xmlns:w="http://schemas.openxmlformats.org/wordprocessingml/2006/main" xmlns:w14="http://schemas.microsoft.com/office/word/2010/wordml" xmlns:w15="http://schemas.microsoft.com/office/word/2012/wordml" xmlns:w16cex="http://schemas.microsoft.com/office/word/2018/wordml/cex" xmlns:w16cid="http://schemas.microsoft.com/office/word/2016/wordml/cid" xmlns:w16="http://schemas.microsoft.com/office/word/2018/wordml" xmlns:w16sdtdh="http://schemas.microsoft.com/office/word/2020/wordml/sdtdatahash" xmlns:w16sdtfl="http://schemas.microsoft.com/office/word/2024/wordml/sdtformatlock" xmlns:w16se="http://schemas.microsoft.com/office/word/2015/wordml/symex" xmlns:w16du="http://schemas.microsoft.com/office/word/2023/wordml/word16du" xmlns:wne="http://schemas.microsoft.com/office/word/2006/wordml" mc:Ignorable="w14 w15 w16se w16cid w16 w16cex w16sdtdh w16sdtfl w16du wp14">
   <w:p>
     <w:pPr>
       <w:pStyle w:val="Header"/>
@@ -24487,7 +26331,7 @@
 </file>
 
 <file path=word/numbering.xml><?xml version="1.0" encoding="utf-8"?>
-<w:numbering xmlns:wpc="http://schemas.microsoft.com/office/word/2010/wordprocessingCanvas" xmlns:cx="http://schemas.microsoft.com/office/drawing/2014/chartex" xmlns:cx1="http://schemas.microsoft.com/office/drawing/2015/9/8/chartex" xmlns:cx2="http://schemas.microsoft.com/office/drawing/2015/10/21/chartex" xmlns:cx3="http://schemas.microsoft.com/office/drawing/2016/5/9/chartex" xmlns:cx4="http://schemas.microsoft.com/office/drawing/2016/5/10/chartex" xmlns:cx5="http://schemas.microsoft.com/office/drawing/2016/5/11/chartex" xmlns:cx6="http://schemas.microsoft.com/office/drawing/2016/5/12/chartex" xmlns:cx7="http://schemas.microsoft.com/office/drawing/2016/5/13/chartex" xmlns:cx8="http://schemas.microsoft.com/office/drawing/2016/5/14/chartex" xmlns:mc="http://schemas.openxmlformats.org/markup-compatibility/2006" xmlns:aink="http://schemas.microsoft.com/office/drawing/2016/ink" xmlns:am3d="http://schemas.microsoft.com/office/drawing/2017/model3d" xmlns:o="urn:schemas-microsoft-com:office:office" xmlns:oel="http://schemas.microsoft.com/office/2019/extlst" xmlns:r="http://schemas.openxmlformats.org/officeDocument/2006/relationships" xmlns:m="http://schemas.openxmlformats.org/officeDocument/2006/math" xmlns:v="urn:schemas-microsoft-com:vml" xmlns:wp14="http://schemas.microsoft.com/office/word/2010/wordprocessingDrawing" xmlns:wp="http://schemas.openxmlformats.org/drawingml/2006/wordprocessingDrawing" xmlns:w10="urn:schemas-microsoft-com:office:word" xmlns:w="http://schemas.openxmlformats.org/wordprocessingml/2006/main" xmlns:w14="http://schemas.microsoft.com/office/word/2010/wordml" xmlns:w15="http://schemas.microsoft.com/office/word/2012/wordml" xmlns:w16cex="http://schemas.microsoft.com/office/word/2018/wordml/cex" xmlns:w16cid="http://schemas.microsoft.com/office/word/2016/wordml/cid" xmlns:w16="http://schemas.microsoft.com/office/word/2018/wordml" xmlns:w16du="http://schemas.microsoft.com/office/word/2023/wordml/word16du" xmlns:w16sdtdh="http://schemas.microsoft.com/office/word/2020/wordml/sdtdatahash" xmlns:w16sdtfl="http://schemas.microsoft.com/office/word/2024/wordml/sdtformatlock" xmlns:w16se="http://schemas.microsoft.com/office/word/2015/wordml/symex" xmlns:wpg="http://schemas.microsoft.com/office/word/2010/wordprocessingGroup" xmlns:wpi="http://schemas.microsoft.com/office/word/2010/wordprocessingInk" xmlns:wne="http://schemas.microsoft.com/office/word/2006/wordml" xmlns:wps="http://schemas.microsoft.com/office/word/2010/wordprocessingShape" mc:Ignorable="w14 w15 w16se w16cid w16 w16cex w16sdtdh w16sdtfl w16du wp14">
+<w:numbering xmlns:wpc="http://schemas.microsoft.com/office/word/2010/wordprocessingCanvas" xmlns:cx="http://schemas.microsoft.com/office/drawing/2014/chartex" xmlns:cx1="http://schemas.microsoft.com/office/drawing/2015/9/8/chartex" xmlns:cx2="http://schemas.microsoft.com/office/drawing/2015/10/21/chartex" xmlns:cx3="http://schemas.microsoft.com/office/drawing/2016/5/9/chartex" xmlns:cx4="http://schemas.microsoft.com/office/drawing/2016/5/10/chartex" xmlns:cx5="http://schemas.microsoft.com/office/drawing/2016/5/11/chartex" xmlns:cx6="http://schemas.microsoft.com/office/drawing/2016/5/12/chartex" xmlns:cx7="http://schemas.microsoft.com/office/drawing/2016/5/13/chartex" xmlns:cx8="http://schemas.microsoft.com/office/drawing/2016/5/14/chartex" xmlns:mc="http://schemas.openxmlformats.org/markup-compatibility/2006" xmlns:m="http://schemas.openxmlformats.org/officeDocument/2006/math" xmlns:aink="http://schemas.microsoft.com/office/drawing/2016/ink" xmlns:am3d="http://schemas.microsoft.com/office/drawing/2017/model3d" xmlns:oel="http://schemas.microsoft.com/office/2019/extlst" xmlns:r="http://schemas.openxmlformats.org/officeDocument/2006/relationships" xmlns:wp14="http://schemas.microsoft.com/office/word/2010/wordprocessingDrawing" xmlns:wp="http://schemas.openxmlformats.org/drawingml/2006/wordprocessingDrawing" xmlns:wpg="http://schemas.microsoft.com/office/word/2010/wordprocessingGroup" xmlns:wpi="http://schemas.microsoft.com/office/word/2010/wordprocessingInk" xmlns:wps="http://schemas.microsoft.com/office/word/2010/wordprocessingShape" xmlns:o="urn:schemas-microsoft-com:office:office" xmlns:v="urn:schemas-microsoft-com:vml" xmlns:w10="urn:schemas-microsoft-com:office:word" xmlns:w="http://schemas.openxmlformats.org/wordprocessingml/2006/main" xmlns:w14="http://schemas.microsoft.com/office/word/2010/wordml" xmlns:w15="http://schemas.microsoft.com/office/word/2012/wordml" xmlns:w16cex="http://schemas.microsoft.com/office/word/2018/wordml/cex" xmlns:w16cid="http://schemas.microsoft.com/office/word/2016/wordml/cid" xmlns:w16="http://schemas.microsoft.com/office/word/2018/wordml" xmlns:w16sdtdh="http://schemas.microsoft.com/office/word/2020/wordml/sdtdatahash" xmlns:w16sdtfl="http://schemas.microsoft.com/office/word/2024/wordml/sdtformatlock" xmlns:w16se="http://schemas.microsoft.com/office/word/2015/wordml/symex" xmlns:w16du="http://schemas.microsoft.com/office/word/2023/wordml/word16du" xmlns:wne="http://schemas.microsoft.com/office/word/2006/wordml" mc:Ignorable="w14 w15 w16se w16cid w16 w16cex w16sdtdh w16sdtfl w16du wp14">
   <w:abstractNum w:abstractNumId="0" w15:restartNumberingAfterBreak="0">
     <w:nsid w:val="01804C27"/>
     <w:multiLevelType w:val="multilevel"/>
@@ -26485,7 +28329,7 @@
 </file>
 
 <file path=word/styles.xml><?xml version="1.0" encoding="utf-8"?>
-<w:styles xmlns:mc="http://schemas.openxmlformats.org/markup-compatibility/2006" xmlns:r="http://schemas.openxmlformats.org/officeDocument/2006/relationships" xmlns:w="http://schemas.openxmlformats.org/wordprocessingml/2006/main" xmlns:w14="http://schemas.microsoft.com/office/word/2010/wordml" xmlns:w15="http://schemas.microsoft.com/office/word/2012/wordml" xmlns:w16cex="http://schemas.microsoft.com/office/word/2018/wordml/cex" xmlns:w16cid="http://schemas.microsoft.com/office/word/2016/wordml/cid" xmlns:w16="http://schemas.microsoft.com/office/word/2018/wordml" xmlns:w16du="http://schemas.microsoft.com/office/word/2023/wordml/word16du" xmlns:w16sdtdh="http://schemas.microsoft.com/office/word/2020/wordml/sdtdatahash" xmlns:w16sdtfl="http://schemas.microsoft.com/office/word/2024/wordml/sdtformatlock" xmlns:w16se="http://schemas.microsoft.com/office/word/2015/wordml/symex" mc:Ignorable="w14 w15 w16se w16cid w16 w16cex w16sdtdh w16sdtfl w16du">
+<w:styles xmlns:mc="http://schemas.openxmlformats.org/markup-compatibility/2006" xmlns:r="http://schemas.openxmlformats.org/officeDocument/2006/relationships" xmlns:w="http://schemas.openxmlformats.org/wordprocessingml/2006/main" xmlns:w14="http://schemas.microsoft.com/office/word/2010/wordml" xmlns:w15="http://schemas.microsoft.com/office/word/2012/wordml" xmlns:w16cex="http://schemas.microsoft.com/office/word/2018/wordml/cex" xmlns:w16cid="http://schemas.microsoft.com/office/word/2016/wordml/cid" xmlns:w16="http://schemas.microsoft.com/office/word/2018/wordml" xmlns:w16sdtdh="http://schemas.microsoft.com/office/word/2020/wordml/sdtdatahash" xmlns:w16sdtfl="http://schemas.microsoft.com/office/word/2024/wordml/sdtformatlock" xmlns:w16se="http://schemas.microsoft.com/office/word/2015/wordml/symex" xmlns:w16du="http://schemas.microsoft.com/office/word/2023/wordml/word16du" mc:Ignorable="w14 w15 w16se w16cid w16 w16cex w16sdtdh w16sdtfl w16du">
   <w:docDefaults>
     <w:rPrDefault>
       <w:rPr>

</xml_diff>